<commit_message>
added published reference and DOI, corrected authorship order
</commit_message>
<xml_diff>
--- a/_book/INSPECT-SR-Guidance.docx
+++ b/_book/INSPECT-SR-Guidance.docx
@@ -23,15 +23,7 @@
         <w:pStyle w:val="Author"/>
       </w:pPr>
       <w:r>
-        <w:t xml:space="preserve">Jack Wilkinson, Calvin Heal, Ella Flemyng, Georgios A. Antoniou, Tony Aburrow, Zarko Alfirevic, Alison Avenell, Virginia Barbour, Vincenzo Berghella, Dorothy V. M. Bishop, Esmée M Bordewijk, Nicholas J. L. Brown, Jana Christopher, Mike Clarke, Darren Dahly, Jane Dennis, Patrick Dicker, Jo Dumville, Helen Frankish, Andrew Grey, Steph Grohmann, Lyle C. Gurrin, Jill A. Hayden, James Heathers, Kylie E Hunter, Ian Hussey, Lukas Jung, Emily Lam, Toby J. Lasserson, Sarah Lensen, Tianjing Li, Wentao Li, Jianping Liu, Elizabeth Loder, Andreas Lundh, Gideon Meyerowitz-Katz, Ben W. Mol, Florian Naudet, Anna Noel-Storr, Neil E. O’Connell, Lisa Parker, Rita F. Redberg, Barbara K. Redman, Rachel Richardson, Anna Lene Seidler, Kyle Sheldrick, Emma Sydenham, Madelon van Wely, Colby J. Vorland, Rui Wang, Stephanie Weibel, Matthias Wjst, Lisa Bero, Jamie J. Kirkham</w:t>
-      </w:r>
-    </w:p>
-    <w:p>
-      <w:pPr>
-        <w:pStyle w:val="Date"/>
-      </w:pPr>
-      <w:r>
-        <w:t xml:space="preserve">Version 1.1.2</w:t>
+        <w:t xml:space="preserve">Jack Wilkinson, Lisa Bero, Calvin Heal, Ella Flemyng, Georgios A. Antoniou, Tony Aburrow, Zarko Alfirevic, Alison Avenell, Virginia Barbour, Vincenzo Berghella, Dorothy V. M. Bishop, Esmée M Bordewijk, Nicholas J. L. Brown, Jana Christopher, Mike Clarke, Darren Dahly, Jane Dennis, Patrick Dicker, Jo Dumville, Helen Frankish, Andrew Grey, Steph Grohmann, Lyle C. Gurrin, Jill A. Hayden, James A. J. Heathers, Kylie E Hunter, Ian Hussey, Lukas Jung, Emily Lam, Toby J. Lasserson, Sarah Lensen, Tianjing Li, Wentao Li, Jianping Liu, Elizabeth Loder, Andreas Lundh, Gideon Meyerowitz-Katz, Ben W. Mol, Florian Naudet, Anna Noel-Storr, Neil E. O’Connell, Lisa Parker, Rita F. Redberg, Barbara K. Redman, Rachel Richardson, Anna Lene Seidler, Kyle Sheldrick, Emma Sydenham, Madelon van Wely, Colby J. Vorland, Rui Wang, Stephanie Weibel, Matthias Wjst, Jamie J. Kirkham</w:t>
       </w:r>
     </w:p>
     <w:sdt>
@@ -60,7 +52,7 @@
         </w:p>
       </w:sdtContent>
     </w:sdt>
-    <w:bookmarkStart w:id="92" w:name="introduction"/>
+    <w:bookmarkStart w:id="98" w:name="introduction"/>
     <w:p>
       <w:pPr>
         <w:pStyle w:val="Heading1"/>
@@ -74,12 +66,60 @@
         <w:pStyle w:val="FirstParagraph"/>
       </w:pPr>
       <w:r>
+        <w:t xml:space="preserve">INSPECT-SR (</w:t>
+      </w:r>
+      <w:hyperlink r:id="rId20">
+        <w:r>
+          <w:rPr>
+            <w:rStyle w:val="Hyperlink"/>
+          </w:rPr>
+          <w:t xml:space="preserve">Wilkinson et al., 2026</w:t>
+        </w:r>
+      </w:hyperlink>
+      <w:r>
+        <w:t xml:space="preserve">) is a tool for assessing the trustworthiness of randomised controlled trials (RCTs) in systematic reviews. It was developed for health RCTs but has utility in other fields too.</w:t>
+      </w:r>
+    </w:p>
+    <w:p>
+      <w:pPr>
+        <w:pStyle w:val="BodyText"/>
+      </w:pPr>
+      <w:r>
+        <w:t xml:space="preserve">INSPECT-SR does not assess internal or external validity (which are covered by Risk of Bias tools and GRADE), nor does it cover conflicts of interest.</w:t>
+      </w:r>
+    </w:p>
+    <w:p>
+      <w:pPr>
+        <w:pStyle w:val="BodyText"/>
+      </w:pPr>
+      <w:r>
+        <w:t xml:space="preserve">INSPECT-SR contains 21 checks across four domains to help the reviewer make a judgement about whether a study’s data and findings can be trusted sufficiently to include it in a research synthesis.</w:t>
+      </w:r>
+    </w:p>
+    <w:bookmarkStart w:id="23" w:name="accessing"/>
+    <w:p>
+      <w:pPr>
+        <w:pStyle w:val="Heading3"/>
+      </w:pPr>
+      <w:r>
+        <w:t xml:space="preserve">Accessing</w:t>
+      </w:r>
+    </w:p>
+    <w:p>
+      <w:pPr>
+        <w:pStyle w:val="Compact"/>
+        <w:numPr>
+          <w:ilvl w:val="0"/>
+          <w:numId w:val="1001"/>
+        </w:numPr>
+      </w:pPr>
+      <w:r>
         <w:t xml:space="preserve">The live website version of this guidance is hosted at</w:t>
       </w:r>
       <w:r>
         <w:t xml:space="preserve"> </w:t>
       </w:r>
-      <w:hyperlink r:id="rId20">
+      <w:hyperlink r:id="rId21">
         <w:r>
           <w:rPr>
             <w:rStyle w:val="Hyperlink"/>
@@ -88,12 +128,12 @@
         </w:r>
       </w:hyperlink>
       <w:r>
-        <w:t xml:space="preserve">. The original address,</w:t>
-      </w:r>
-      <w:r>
-        <w:t xml:space="preserve"> </w:t>
-      </w:r>
-      <w:hyperlink r:id="rId21">
+        <w:t xml:space="preserve">, which can also be reached via</w:t>
+      </w:r>
+      <w:r>
+        <w:t xml:space="preserve"> </w:t>
+      </w:r>
+      <w:hyperlink r:id="rId22">
         <w:r>
           <w:rPr>
             <w:rStyle w:val="Hyperlink"/>
@@ -102,7 +142,7 @@
         </w:r>
       </w:hyperlink>
       <w:r>
-        <w:t xml:space="preserve">, also works and redirects here — both are maintained permanently, but</w:t>
+        <w:t xml:space="preserve">. Both are maintained permanently, but</w:t>
       </w:r>
       <w:r>
         <w:t xml:space="preserve"> </w:t>
@@ -137,59 +177,30 @@
     </w:p>
     <w:p>
       <w:pPr>
-        <w:pStyle w:val="BodyText"/>
-      </w:pPr>
-      <w:r>
-        <w:t xml:space="preserve">A pdf of the website is also hosted on OSF (</w:t>
-      </w:r>
-      <w:hyperlink r:id="rId22">
-        <w:r>
-          <w:rPr>
-            <w:rStyle w:val="Hyperlink"/>
-          </w:rPr>
-          <w:t xml:space="preserve">https://osf.io/b74wj/</w:t>
-        </w:r>
-      </w:hyperlink>
-      <w:r>
-        <w:t xml:space="preserve">).</w:t>
-      </w:r>
-    </w:p>
-    <w:p>
-      <w:pPr>
-        <w:pStyle w:val="BodyText"/>
-      </w:pPr>
-      <w:r>
-        <w:t xml:space="preserve">INSPECT-SR (</w:t>
-      </w:r>
-      <w:hyperlink r:id="rId23">
-        <w:r>
-          <w:rPr>
-            <w:rStyle w:val="Hyperlink"/>
-          </w:rPr>
-          <w:t xml:space="preserve">Wilkinson et al., 2025</w:t>
-        </w:r>
-      </w:hyperlink>
-      <w:r>
-        <w:t xml:space="preserve">) is a tool for assessing the trustworthiness of randomised controlled trials (RCTs) in systematic reviews. It was developed for health RCTs but has utility in other fields too.</w:t>
-      </w:r>
-    </w:p>
-    <w:p>
-      <w:pPr>
-        <w:pStyle w:val="BodyText"/>
-      </w:pPr>
-      <w:r>
-        <w:t xml:space="preserve">INSPECT-SR does not assess internal or external validity (which are covered by Risk of Bias tools and GRADE), nor does it cover conflicts of interest.</w:t>
-      </w:r>
-    </w:p>
-    <w:p>
-      <w:pPr>
-        <w:pStyle w:val="BodyText"/>
-      </w:pPr>
-      <w:r>
-        <w:t xml:space="preserve">INSPECT-SR contains 21 checks across four domains to help the reviewer make a judgement about whether a study’s data and findings can be trusted sufficiently to include it in a research synthesis.</w:t>
-      </w:r>
-    </w:p>
-    <w:bookmarkStart w:id="25" w:name="citation"/>
+        <w:pStyle w:val="Compact"/>
+        <w:numPr>
+          <w:ilvl w:val="0"/>
+          <w:numId w:val="1001"/>
+        </w:numPr>
+      </w:pPr>
+      <w:r>
+        <w:t xml:space="preserve">A pdf of the current version of the guidance is available: click the</w:t>
+      </w:r>
+      <w:r>
+        <w:t xml:space="preserve"> </w:t>
+      </w:r>
+      <w:r>
+        <w:t xml:space="preserve">“PDF”</w:t>
+      </w:r>
+      <w:r>
+        <w:t xml:space="preserve"> </w:t>
+      </w:r>
+      <w:r>
+        <w:t xml:space="preserve">button at the top left hand side of the page.</w:t>
+      </w:r>
+    </w:p>
+    <w:bookmarkEnd w:id="23"/>
+    <w:bookmarkStart w:id="24" w:name="citation"/>
     <w:p>
       <w:pPr>
         <w:pStyle w:val="Heading2"/>
@@ -221,20 +232,38 @@
     </w:p>
     <w:p>
       <w:pPr>
+        <w:pStyle w:val="BodyText"/>
+      </w:pPr>
+      <w:r>
+        <w:t xml:space="preserve">APA format:</w:t>
+      </w:r>
+    </w:p>
+    <w:p>
+      <w:pPr>
         <w:pStyle w:val="BlockText"/>
       </w:pPr>
       <w:r>
-        <w:t xml:space="preserve">Wilkinson JD, Heal C, Flemyng E, Antoniou GA, Aburrow T, Alfirevic Z, Avenell A, Barbour V, Berghella V, Bishop DVM, Bordewijk EM, Brown NJL, Christopher J, Clarke M, Dahly DL, Dennis J, Dicker P, Dumville J, Grey A, Grohmann S, Gurrin LC, Hayden JA, Heathers JAJ, Hunter KE, Hussey I, Jung L, Lam E, Lasserson TJ, Lensen S, Li T, Li W, Liu J, Loder E, Lundh A, Meyerowitz-Katz G, Mol BW, Naudet F, Noel-Storr A, O’Connell N, Parker L, Redberg RF, Redman BK, Richardson R, Seidler AL, Sheldrick K, Sydenham E, van Wely M, Vorland C, Wang R, Weibel S, Wjst M, Bero L, Kirkham JJ. (2025) INSPECT-SR: a tool for assessing trustworthiness of randomised controlled trials. medRxiv 2025.09.03.25334905; doi:</w:t>
-      </w:r>
-      <w:r>
-        <w:t xml:space="preserve"> </w:t>
-      </w:r>
-      <w:hyperlink r:id="rId23">
+        <w:t xml:space="preserve">Wilkinson, J., Bero, L., Heal, C., Flemyng, E., Antoniou, G. A., Aburrow, T., Alfirevic, Z., Avenell, A., Barbour, V., Berghella, V., Bishop, D. V. M., Bordewijk, E. M., Brown, N. J. L., Christopher, J., Clarke, M., Dahly, D., Dennis, J., Dicker, P., Dumville, J., Frankish, H., Grey, A., Grohmann, S., Gurrin, L. C., Hayden, J. A., Heathers, J. A. J., Hunter, K. E., Hussey, I., Jung, L., Lam, E., Lasserson, T. J., Lensen, S., Li, T., Li, W., Liu, J., Loder, E., Lundh, A., Meyerowitz-Katz, G., Mol, B. W., Naudet, F., Noel-Storr, A., O’Connell, N. E., Parker, L., Redberg, R. F., Redman, B. K., Richardson, R., Seidler, A. L., Sheldrick, K., Sydenham, E., van Wely, M., Vorland, C. J., Wang, R., Weibel, S., Wjst, M., &amp; Kirkham, J. J. (2026). INSPECT-SR tool for assessing trustworthiness of randomised controlled trials.</w:t>
+      </w:r>
+      <w:r>
+        <w:t xml:space="preserve"> </w:t>
+      </w:r>
+      <w:r>
+        <w:rPr>
+          <w:i/>
+          <w:iCs/>
+        </w:rPr>
+        <w:t xml:space="preserve">BMJ, 394</w:t>
+      </w:r>
+      <w:r>
+        <w:t xml:space="preserve">, e100611 doi:</w:t>
+      </w:r>
+      <w:hyperlink r:id="rId20">
         <w:r>
           <w:rPr>
             <w:rStyle w:val="Hyperlink"/>
           </w:rPr>
-          <w:t xml:space="preserve">10.1101/2025.09.03.25334905</w:t>
+          <w:t xml:space="preserve">10.1136/bmj-2026-100611</w:t>
         </w:r>
       </w:hyperlink>
     </w:p>
@@ -243,44 +272,41 @@
         <w:pStyle w:val="FirstParagraph"/>
       </w:pPr>
       <w:r>
-        <w:t xml:space="preserve">You might also wish to include the version number of the guidance you used in the citation, which is available at the top of the home page of the website and below the list of authors on the first page of the pdf.</w:t>
-      </w:r>
-    </w:p>
-    <w:p>
-      <w:pPr>
-        <w:pStyle w:val="BodyText"/>
-      </w:pPr>
-      <w:r>
-        <w:t xml:space="preserve">Technically, this guidance website and its GitHub repository has its own DOI and is archived on Zenodo. However, please cite the publication itself, above.</w:t>
-      </w:r>
-    </w:p>
-    <w:p>
-      <w:pPr>
-        <w:pStyle w:val="BodyText"/>
-      </w:pPr>
-      <w:r>
-        <w:t xml:space="preserve">DOI:</w:t>
-      </w:r>
-      <w:r>
-        <w:t xml:space="preserve"> </w:t>
-      </w:r>
-      <w:hyperlink r:id="rId24">
+        <w:t xml:space="preserve">Vancouver format:</w:t>
+      </w:r>
+    </w:p>
+    <w:p>
+      <w:pPr>
+        <w:pStyle w:val="BlockText"/>
+      </w:pPr>
+      <w:r>
+        <w:t xml:space="preserve">Wilkinson J, Bero L, Heal C, Flemyng E, Antoniou GA, Aburrow T, Alfirevic Z, Avenell A, Barbour V, Berghella V, Bishop DVM, Bordewijk EM, Brown NJL, Christopher J, Clarke M, Dahly D, Dennis J, Dicker P, Dumville J, Frankish H, Grey A, Grohmann S, Gurrin LC, Hayden JA, Heathers JAJ, Hunter KE, Hussey I, Jung L, Lam E, Lasserson TJ, Lensen S, Li T, Li W, Liu J, Loder E, Lundh A, Meyerowitz-Katz G, Mol BW, Naudet F, Noel-Storr A, O’Connell, NE, Parker L, Redberg RF, Redman BK, Richardson R, Seidler AL, Sheldrick K, Sydenham E, van Wely M, Vorland CJ, Wang R, Weibel S, Wjst M, Kirkham JJ. INSPECT-SR tool for assessing trustworthiness of randomised controlled trials. BMJ. 2026;394:e100611. doi:</w:t>
+      </w:r>
+      <w:hyperlink r:id="rId20">
         <w:r>
           <w:rPr>
             <w:rStyle w:val="Hyperlink"/>
           </w:rPr>
-          <w:t xml:space="preserve">10.5281/zenodo.21905597</w:t>
+          <w:t xml:space="preserve">10.1136/bmj-2026-100611</w:t>
         </w:r>
       </w:hyperlink>
     </w:p>
-    <w:bookmarkEnd w:id="25"/>
-    <w:bookmarkStart w:id="73" w:name="contributors"/>
+    <w:p>
+      <w:pPr>
+        <w:pStyle w:val="FirstParagraph"/>
+      </w:pPr>
+      <w:r>
+        <w:t xml:space="preserve">You might also wish to include the version number of the guidance you used in the citation, which is available at the top of the home page of the website and below the list of authors on the first page of the pdf.</w:t>
+      </w:r>
+    </w:p>
+    <w:bookmarkEnd w:id="24"/>
+    <w:bookmarkStart w:id="26" w:name="version-and-feedback"/>
     <w:p>
       <w:pPr>
         <w:pStyle w:val="Heading2"/>
       </w:pPr>
       <w:r>
-        <w:t xml:space="preserve">Contributors</w:t>
+        <w:t xml:space="preserve">Version and feedback</w:t>
       </w:r>
     </w:p>
     <w:p>
@@ -288,26 +314,36 @@
         <w:pStyle w:val="FirstParagraph"/>
       </w:pPr>
       <w:r>
-        <w:t xml:space="preserve">This site is maintained by Ian Hussey and Jack Wilkinson. If you find issues etc, you can open an issue or pull request on the</w:t>
-      </w:r>
-      <w:r>
-        <w:t xml:space="preserve"> </w:t>
-      </w:r>
-      <w:hyperlink r:id="rId26">
+        <w:t xml:space="preserve">It is anticipated that the guidance document will be continually revised in response to feedback and ongoing monitoring of use of the tool. This will include the addition of more examples to illustrate both correct and improper use of the checks. Reviewers of the tool may provide anonymous feedback on their experience using</w:t>
+      </w:r>
+      <w:r>
+        <w:t xml:space="preserve"> </w:t>
+      </w:r>
+      <w:hyperlink r:id="rId25">
         <w:r>
           <w:rPr>
             <w:rStyle w:val="Hyperlink"/>
           </w:rPr>
-          <w:t xml:space="preserve">GitHub repository</w:t>
+          <w:t xml:space="preserve">this survey</w:t>
         </w:r>
       </w:hyperlink>
       <w:r>
-        <w:t xml:space="preserve">.</w:t>
-      </w:r>
-    </w:p>
-    <w:p>
-      <w:pPr>
-        <w:pStyle w:val="BodyText"/>
+        <w:t xml:space="preserve">. This feedback will be monitored by the INSPECT-SR Study Management Group, and feedback will be used to update the guidance document. However, reviewers should not expect responses to questions posted on the feedback survey.</w:t>
+      </w:r>
+    </w:p>
+    <w:bookmarkEnd w:id="26"/>
+    <w:bookmarkStart w:id="73" w:name="contributors"/>
+    <w:p>
+      <w:pPr>
+        <w:pStyle w:val="Heading2"/>
+      </w:pPr>
+      <w:r>
+        <w:t xml:space="preserve">Contributors</w:t>
+      </w:r>
+    </w:p>
+    <w:p>
+      <w:pPr>
+        <w:pStyle w:val="FirstParagraph"/>
       </w:pPr>
       <w:r>
         <w:t xml:space="preserve">Each contributors role is listed below (e.g., contribution to the INSPECT-SR article or the guidance listed on this website).</w:t>
@@ -417,7 +453,7 @@
               <w:jc w:val="left"/>
             </w:pPr>
             <w:r>
-              <w:t xml:space="preserve">Calvin Heal</w:t>
+              <w:t xml:space="preserve">Lisa Bero</w:t>
             </w:r>
             <w:r>
               <w:t xml:space="preserve"> </w:t>
@@ -459,7 +495,7 @@
               <w:jc w:val="left"/>
             </w:pPr>
             <w:r>
-              <w:t xml:space="preserve">Ella Flemyng</w:t>
+              <w:t xml:space="preserve">Calvin Heal</w:t>
             </w:r>
             <w:r>
               <w:t xml:space="preserve"> </w:t>
@@ -501,8 +537,12 @@
               <w:jc w:val="left"/>
             </w:pPr>
             <w:r>
-              <w:t xml:space="preserve">Georgios A. Antoniou</w:t>
-            </w:r>
+              <w:t xml:space="preserve">Ella Flemyng</w:t>
+            </w:r>
+            <w:r>
+              <w:t xml:space="preserve"> </w:t>
+            </w:r>
+            <w:hyperlink r:id="rId30"/>
           </w:p>
         </w:tc>
         <w:tc>
@@ -539,7 +579,7 @@
               <w:jc w:val="left"/>
             </w:pPr>
             <w:r>
-              <w:t xml:space="preserve">Tony Aburrow</w:t>
+              <w:t xml:space="preserve">Georgios A. Antoniou</w:t>
             </w:r>
           </w:p>
         </w:tc>
@@ -577,12 +617,8 @@
               <w:jc w:val="left"/>
             </w:pPr>
             <w:r>
-              <w:t xml:space="preserve">Zarko Alfirevic</w:t>
-            </w:r>
-            <w:r>
-              <w:t xml:space="preserve"> </w:t>
-            </w:r>
-            <w:hyperlink r:id="rId30"/>
+              <w:t xml:space="preserve">Tony Aburrow</w:t>
+            </w:r>
           </w:p>
         </w:tc>
         <w:tc>
@@ -619,7 +655,7 @@
               <w:jc w:val="left"/>
             </w:pPr>
             <w:r>
-              <w:t xml:space="preserve">Alison Avenell</w:t>
+              <w:t xml:space="preserve">Zarko Alfirevic</w:t>
             </w:r>
             <w:r>
               <w:t xml:space="preserve"> </w:t>
@@ -661,7 +697,7 @@
               <w:jc w:val="left"/>
             </w:pPr>
             <w:r>
-              <w:t xml:space="preserve">Virginia Barbour</w:t>
+              <w:t xml:space="preserve">Alison Avenell</w:t>
             </w:r>
             <w:r>
               <w:t xml:space="preserve"> </w:t>
@@ -703,7 +739,7 @@
               <w:jc w:val="left"/>
             </w:pPr>
             <w:r>
-              <w:t xml:space="preserve">Vincenzo Berghella</w:t>
+              <w:t xml:space="preserve">Virginia Barbour</w:t>
             </w:r>
             <w:r>
               <w:t xml:space="preserve"> </w:t>
@@ -745,7 +781,7 @@
               <w:jc w:val="left"/>
             </w:pPr>
             <w:r>
-              <w:t xml:space="preserve">Dorothy V. M. Bishop</w:t>
+              <w:t xml:space="preserve">Vincenzo Berghella</w:t>
             </w:r>
             <w:r>
               <w:t xml:space="preserve"> </w:t>
@@ -787,7 +823,7 @@
               <w:jc w:val="left"/>
             </w:pPr>
             <w:r>
-              <w:t xml:space="preserve">Esmée M Bordewijk</w:t>
+              <w:t xml:space="preserve">Dorothy V. M. Bishop</w:t>
             </w:r>
             <w:r>
               <w:t xml:space="preserve"> </w:t>
@@ -829,7 +865,7 @@
               <w:jc w:val="left"/>
             </w:pPr>
             <w:r>
-              <w:t xml:space="preserve">Nicholas J. L. Brown</w:t>
+              <w:t xml:space="preserve">Esmée M. Bordewijk</w:t>
             </w:r>
             <w:r>
               <w:t xml:space="preserve"> </w:t>
@@ -871,7 +907,7 @@
               <w:jc w:val="left"/>
             </w:pPr>
             <w:r>
-              <w:t xml:space="preserve">Jana Christopher</w:t>
+              <w:t xml:space="preserve">Nicholas J. L. Brown</w:t>
             </w:r>
             <w:r>
               <w:t xml:space="preserve"> </w:t>
@@ -913,7 +949,7 @@
               <w:jc w:val="left"/>
             </w:pPr>
             <w:r>
-              <w:t xml:space="preserve">Mike Clarke</w:t>
+              <w:t xml:space="preserve">Jana Christopher</w:t>
             </w:r>
             <w:r>
               <w:t xml:space="preserve"> </w:t>
@@ -955,7 +991,7 @@
               <w:jc w:val="left"/>
             </w:pPr>
             <w:r>
-              <w:t xml:space="preserve">Darren Dahly</w:t>
+              <w:t xml:space="preserve">Mike Clarke</w:t>
             </w:r>
             <w:r>
               <w:t xml:space="preserve"> </w:t>
@@ -997,7 +1033,7 @@
               <w:jc w:val="left"/>
             </w:pPr>
             <w:r>
-              <w:t xml:space="preserve">Jane Dennis</w:t>
+              <w:t xml:space="preserve">Darren Dahly</w:t>
             </w:r>
             <w:r>
               <w:t xml:space="preserve"> </w:t>
@@ -1039,7 +1075,7 @@
               <w:jc w:val="left"/>
             </w:pPr>
             <w:r>
-              <w:t xml:space="preserve">Patrick Dicker</w:t>
+              <w:t xml:space="preserve">Jane Dennis</w:t>
             </w:r>
             <w:r>
               <w:t xml:space="preserve"> </w:t>
@@ -1081,7 +1117,7 @@
               <w:jc w:val="left"/>
             </w:pPr>
             <w:r>
-              <w:t xml:space="preserve">Jo Dumville</w:t>
+              <w:t xml:space="preserve">Patrick Dicker</w:t>
             </w:r>
             <w:r>
               <w:t xml:space="preserve"> </w:t>
@@ -1123,8 +1159,12 @@
               <w:jc w:val="left"/>
             </w:pPr>
             <w:r>
-              <w:t xml:space="preserve">Helen Frankish</w:t>
-            </w:r>
+              <w:t xml:space="preserve">Jo Dumville</w:t>
+            </w:r>
+            <w:r>
+              <w:t xml:space="preserve"> </w:t>
+            </w:r>
+            <w:hyperlink r:id="rId43"/>
           </w:p>
         </w:tc>
         <w:tc>
@@ -1161,12 +1201,8 @@
               <w:jc w:val="left"/>
             </w:pPr>
             <w:r>
-              <w:t xml:space="preserve">Andrew Grey</w:t>
-            </w:r>
-            <w:r>
-              <w:t xml:space="preserve"> </w:t>
-            </w:r>
-            <w:hyperlink r:id="rId43"/>
+              <w:t xml:space="preserve">Helen Frankish</w:t>
+            </w:r>
           </w:p>
         </w:tc>
         <w:tc>
@@ -1203,7 +1239,7 @@
               <w:jc w:val="left"/>
             </w:pPr>
             <w:r>
-              <w:t xml:space="preserve">Steph Grohmann</w:t>
+              <w:t xml:space="preserve">Andrew Grey</w:t>
             </w:r>
             <w:r>
               <w:t xml:space="preserve"> </w:t>
@@ -1245,8 +1281,12 @@
               <w:jc w:val="left"/>
             </w:pPr>
             <w:r>
-              <w:t xml:space="preserve">Lyle C. Gurrin</w:t>
-            </w:r>
+              <w:t xml:space="preserve">Steph Grohmann</w:t>
+            </w:r>
+            <w:r>
+              <w:t xml:space="preserve"> </w:t>
+            </w:r>
+            <w:hyperlink r:id="rId45"/>
           </w:p>
         </w:tc>
         <w:tc>
@@ -1283,12 +1323,8 @@
               <w:jc w:val="left"/>
             </w:pPr>
             <w:r>
-              <w:t xml:space="preserve">Jill A. Hayden</w:t>
-            </w:r>
-            <w:r>
-              <w:t xml:space="preserve"> </w:t>
-            </w:r>
-            <w:hyperlink r:id="rId45"/>
+              <w:t xml:space="preserve">Lyle C. Gurrin</w:t>
+            </w:r>
           </w:p>
         </w:tc>
         <w:tc>
@@ -1325,7 +1361,7 @@
               <w:jc w:val="left"/>
             </w:pPr>
             <w:r>
-              <w:t xml:space="preserve">James Heathers</w:t>
+              <w:t xml:space="preserve">Jill A. Hayden</w:t>
             </w:r>
             <w:r>
               <w:t xml:space="preserve"> </w:t>
@@ -1367,7 +1403,7 @@
               <w:jc w:val="left"/>
             </w:pPr>
             <w:r>
-              <w:t xml:space="preserve">Kylie E Hunter</w:t>
+              <w:t xml:space="preserve">James Heathers</w:t>
             </w:r>
             <w:r>
               <w:t xml:space="preserve"> </w:t>
@@ -1409,7 +1445,7 @@
               <w:jc w:val="left"/>
             </w:pPr>
             <w:r>
-              <w:t xml:space="preserve">Ian Hussey</w:t>
+              <w:t xml:space="preserve">Kylie E. Hunter</w:t>
             </w:r>
             <w:r>
               <w:t xml:space="preserve"> </w:t>
@@ -1451,7 +1487,7 @@
               <w:jc w:val="left"/>
             </w:pPr>
             <w:r>
-              <w:t xml:space="preserve">Lukas Jung</w:t>
+              <w:t xml:space="preserve">Ian Hussey</w:t>
             </w:r>
             <w:r>
               <w:t xml:space="preserve"> </w:t>
@@ -1493,8 +1529,12 @@
               <w:jc w:val="left"/>
             </w:pPr>
             <w:r>
-              <w:t xml:space="preserve">Emily Lam</w:t>
-            </w:r>
+              <w:t xml:space="preserve">Lukas Jung</w:t>
+            </w:r>
+            <w:r>
+              <w:t xml:space="preserve"> </w:t>
+            </w:r>
+            <w:hyperlink r:id="rId50"/>
           </w:p>
         </w:tc>
         <w:tc>
@@ -1531,12 +1571,8 @@
               <w:jc w:val="left"/>
             </w:pPr>
             <w:r>
-              <w:t xml:space="preserve">Toby J. Lasserson</w:t>
-            </w:r>
-            <w:r>
-              <w:t xml:space="preserve"> </w:t>
-            </w:r>
-            <w:hyperlink r:id="rId50"/>
+              <w:t xml:space="preserve">Emily Lam</w:t>
+            </w:r>
           </w:p>
         </w:tc>
         <w:tc>
@@ -1573,7 +1609,7 @@
               <w:jc w:val="left"/>
             </w:pPr>
             <w:r>
-              <w:t xml:space="preserve">Sarah Lensen</w:t>
+              <w:t xml:space="preserve">Toby J. Lasserson</w:t>
             </w:r>
             <w:r>
               <w:t xml:space="preserve"> </w:t>
@@ -1615,7 +1651,7 @@
               <w:jc w:val="left"/>
             </w:pPr>
             <w:r>
-              <w:t xml:space="preserve">Tianjing Li</w:t>
+              <w:t xml:space="preserve">Sarah Lensen</w:t>
             </w:r>
             <w:r>
               <w:t xml:space="preserve"> </w:t>
@@ -1657,7 +1693,7 @@
               <w:jc w:val="left"/>
             </w:pPr>
             <w:r>
-              <w:t xml:space="preserve">Wentao Li</w:t>
+              <w:t xml:space="preserve">Tianjing Li</w:t>
             </w:r>
             <w:r>
               <w:t xml:space="preserve"> </w:t>
@@ -1699,7 +1735,7 @@
               <w:jc w:val="left"/>
             </w:pPr>
             <w:r>
-              <w:t xml:space="preserve">Jianping Liu</w:t>
+              <w:t xml:space="preserve">Wentao Li</w:t>
             </w:r>
             <w:r>
               <w:t xml:space="preserve"> </w:t>
@@ -1741,8 +1777,12 @@
               <w:jc w:val="left"/>
             </w:pPr>
             <w:r>
-              <w:t xml:space="preserve">Elizabeth Loder</w:t>
-            </w:r>
+              <w:t xml:space="preserve">Jianping Liu</w:t>
+            </w:r>
+            <w:r>
+              <w:t xml:space="preserve"> </w:t>
+            </w:r>
+            <w:hyperlink r:id="rId55"/>
           </w:p>
         </w:tc>
         <w:tc>
@@ -1779,12 +1819,8 @@
               <w:jc w:val="left"/>
             </w:pPr>
             <w:r>
-              <w:t xml:space="preserve">Andreas Lundh</w:t>
-            </w:r>
-            <w:r>
-              <w:t xml:space="preserve"> </w:t>
-            </w:r>
-            <w:hyperlink r:id="rId55"/>
+              <w:t xml:space="preserve">Elizabeth Loder</w:t>
+            </w:r>
           </w:p>
         </w:tc>
         <w:tc>
@@ -1821,7 +1857,7 @@
               <w:jc w:val="left"/>
             </w:pPr>
             <w:r>
-              <w:t xml:space="preserve">Gideon Meyerowitz-Katz</w:t>
+              <w:t xml:space="preserve">Andreas Lundh</w:t>
             </w:r>
             <w:r>
               <w:t xml:space="preserve"> </w:t>
@@ -1863,7 +1899,7 @@
               <w:jc w:val="left"/>
             </w:pPr>
             <w:r>
-              <w:t xml:space="preserve">Ben W. Mol</w:t>
+              <w:t xml:space="preserve">Gideon Meyerowitz-Katz</w:t>
             </w:r>
             <w:r>
               <w:t xml:space="preserve"> </w:t>
@@ -1905,7 +1941,7 @@
               <w:jc w:val="left"/>
             </w:pPr>
             <w:r>
-              <w:t xml:space="preserve">Florian Naudet</w:t>
+              <w:t xml:space="preserve">Ben W. Mol</w:t>
             </w:r>
             <w:r>
               <w:t xml:space="preserve"> </w:t>
@@ -1947,7 +1983,7 @@
               <w:jc w:val="left"/>
             </w:pPr>
             <w:r>
-              <w:t xml:space="preserve">Anna Noel-Storr</w:t>
+              <w:t xml:space="preserve">Florian Naudet</w:t>
             </w:r>
             <w:r>
               <w:t xml:space="preserve"> </w:t>
@@ -1989,7 +2025,7 @@
               <w:jc w:val="left"/>
             </w:pPr>
             <w:r>
-              <w:t xml:space="preserve">Neil E. O’Connell</w:t>
+              <w:t xml:space="preserve">Anna Noel-Storr</w:t>
             </w:r>
             <w:r>
               <w:t xml:space="preserve"> </w:t>
@@ -2031,8 +2067,12 @@
               <w:jc w:val="left"/>
             </w:pPr>
             <w:r>
-              <w:t xml:space="preserve">Lisa Parker</w:t>
-            </w:r>
+              <w:t xml:space="preserve">Neil E. O’Connell</w:t>
+            </w:r>
+            <w:r>
+              <w:t xml:space="preserve"> </w:t>
+            </w:r>
+            <w:hyperlink r:id="rId61"/>
           </w:p>
         </w:tc>
         <w:tc>
@@ -2069,7 +2109,7 @@
               <w:jc w:val="left"/>
             </w:pPr>
             <w:r>
-              <w:t xml:space="preserve">Rita F. Redberg</w:t>
+              <w:t xml:space="preserve">Lisa Parker</w:t>
             </w:r>
           </w:p>
         </w:tc>
@@ -2107,12 +2147,8 @@
               <w:jc w:val="left"/>
             </w:pPr>
             <w:r>
-              <w:t xml:space="preserve">Barbara K. Redman</w:t>
-            </w:r>
-            <w:r>
-              <w:t xml:space="preserve"> </w:t>
-            </w:r>
-            <w:hyperlink r:id="rId61"/>
+              <w:t xml:space="preserve">Rita F. Redberg</w:t>
+            </w:r>
           </w:p>
         </w:tc>
         <w:tc>
@@ -2149,7 +2185,7 @@
               <w:jc w:val="left"/>
             </w:pPr>
             <w:r>
-              <w:t xml:space="preserve">Rachel Richardson</w:t>
+              <w:t xml:space="preserve">Barbara K. Redman</w:t>
             </w:r>
             <w:r>
               <w:t xml:space="preserve"> </w:t>
@@ -2191,7 +2227,7 @@
               <w:jc w:val="left"/>
             </w:pPr>
             <w:r>
-              <w:t xml:space="preserve">Anna Lene Seidler</w:t>
+              <w:t xml:space="preserve">Rachel Richardson</w:t>
             </w:r>
             <w:r>
               <w:t xml:space="preserve"> </w:t>
@@ -2233,7 +2269,7 @@
               <w:jc w:val="left"/>
             </w:pPr>
             <w:r>
-              <w:t xml:space="preserve">Kyle Sheldrick</w:t>
+              <w:t xml:space="preserve">Anna Lene Seidler</w:t>
             </w:r>
             <w:r>
               <w:t xml:space="preserve"> </w:t>
@@ -2275,7 +2311,7 @@
               <w:jc w:val="left"/>
             </w:pPr>
             <w:r>
-              <w:t xml:space="preserve">Emma Sydenham</w:t>
+              <w:t xml:space="preserve">Kyle Sheldrick</w:t>
             </w:r>
             <w:r>
               <w:t xml:space="preserve"> </w:t>
@@ -2317,7 +2353,7 @@
               <w:jc w:val="left"/>
             </w:pPr>
             <w:r>
-              <w:t xml:space="preserve">Madelon van Wely</w:t>
+              <w:t xml:space="preserve">Emma Sydenham</w:t>
             </w:r>
             <w:r>
               <w:t xml:space="preserve"> </w:t>
@@ -2359,7 +2395,7 @@
               <w:jc w:val="left"/>
             </w:pPr>
             <w:r>
-              <w:t xml:space="preserve">Colby J. Vorland</w:t>
+              <w:t xml:space="preserve">Madelon van Wely</w:t>
             </w:r>
             <w:r>
               <w:t xml:space="preserve"> </w:t>
@@ -2401,7 +2437,7 @@
               <w:jc w:val="left"/>
             </w:pPr>
             <w:r>
-              <w:t xml:space="preserve">Rui Wang</w:t>
+              <w:t xml:space="preserve">Colby J. Vorland</w:t>
             </w:r>
             <w:r>
               <w:t xml:space="preserve"> </w:t>
@@ -2443,7 +2479,7 @@
               <w:jc w:val="left"/>
             </w:pPr>
             <w:r>
-              <w:t xml:space="preserve">Stephanie Weibel</w:t>
+              <w:t xml:space="preserve">Rui Wang</w:t>
             </w:r>
             <w:r>
               <w:t xml:space="preserve"> </w:t>
@@ -2485,7 +2521,7 @@
               <w:jc w:val="left"/>
             </w:pPr>
             <w:r>
-              <w:t xml:space="preserve">Matthias Wjst</w:t>
+              <w:t xml:space="preserve">Stephanie Weibel</w:t>
             </w:r>
             <w:r>
               <w:t xml:space="preserve"> </w:t>
@@ -2527,7 +2563,7 @@
               <w:jc w:val="left"/>
             </w:pPr>
             <w:r>
-              <w:t xml:space="preserve">Lisa Bero</w:t>
+              <w:t xml:space="preserve">Matthias Wjst</w:t>
             </w:r>
             <w:r>
               <w:t xml:space="preserve"> </w:t>
@@ -2604,13 +2640,13 @@
       </w:tr>
     </w:tbl>
     <w:bookmarkEnd w:id="73"/>
-    <w:bookmarkStart w:id="74" w:name="motivation-for-inspect-sr"/>
+    <w:bookmarkStart w:id="74" w:name="motivation"/>
     <w:p>
       <w:pPr>
         <w:pStyle w:val="Heading2"/>
       </w:pPr>
       <w:r>
-        <w:t xml:space="preserve">Motivation for INSPECT-SR</w:t>
+        <w:t xml:space="preserve">Motivation</w:t>
       </w:r>
     </w:p>
     <w:p>
@@ -2639,45 +2675,13 @@
       </w:r>
     </w:p>
     <w:bookmarkEnd w:id="74"/>
-    <w:bookmarkStart w:id="76" w:name="version-and-feedback"/>
+    <w:bookmarkStart w:id="75" w:name="overview-of-the-tool"/>
     <w:p>
       <w:pPr>
         <w:pStyle w:val="Heading2"/>
       </w:pPr>
       <w:r>
-        <w:t xml:space="preserve">Version and feedback</w:t>
-      </w:r>
-    </w:p>
-    <w:p>
-      <w:pPr>
-        <w:pStyle w:val="FirstParagraph"/>
-      </w:pPr>
-      <w:r>
-        <w:t xml:space="preserve">The current version number of the INSPECT-SR guidance document is visible at the top of this page. It is anticipated that the guidance document will be continually revised in response to feedback and ongoing monitoring of use of the tool. This will include the addition of more examples to illustrate both correct and improper use of the checks. Reviewers of the tool may provide anonymous feedback on their experience using</w:t>
-      </w:r>
-      <w:r>
-        <w:t xml:space="preserve"> </w:t>
-      </w:r>
-      <w:hyperlink r:id="rId75">
-        <w:r>
-          <w:rPr>
-            <w:rStyle w:val="Hyperlink"/>
-          </w:rPr>
-          <w:t xml:space="preserve">this survey</w:t>
-        </w:r>
-      </w:hyperlink>
-      <w:r>
-        <w:t xml:space="preserve">. This feedback will be monitored by the INSPECT-SR Study Management Group, and feedback will be used to update the guidance document. However, reviewers should not expect responses to questions posted on the feedback survey.</w:t>
-      </w:r>
-    </w:p>
-    <w:bookmarkEnd w:id="76"/>
-    <w:bookmarkStart w:id="77" w:name="overview-of-the-inspect-sr-tool"/>
-    <w:p>
-      <w:pPr>
-        <w:pStyle w:val="Heading2"/>
-      </w:pPr>
-      <w:r>
-        <w:t xml:space="preserve">Overview of the INSPECT-SR tool</w:t>
+        <w:t xml:space="preserve">Overview of the tool</w:t>
       </w:r>
     </w:p>
     <w:p>
@@ -2846,19 +2850,32 @@
         <w:t xml:space="preserve">The checks in each domain assist the systematic reviewer in identifying any domain-level concerns relating to trustworthiness. The reviewer may then use the domain-level judgement to arrive at an overall judgement about the trustworthiness of a trial. We emphasise that concerns about a trial’s trustworthiness do not amount to an accusation of misconduct. INSPECT-SR is not concerned with determining whether inauthentic data have arisen due to deliberate misconduct or honest error.</w:t>
       </w:r>
     </w:p>
-    <w:bookmarkEnd w:id="77"/>
-    <w:bookmarkStart w:id="78" w:name="X9100f48009e94b370d8c0b155865ee9c9f739f4"/>
+    <w:bookmarkEnd w:id="75"/>
+    <w:bookmarkStart w:id="77" w:name="Xfed46915ce54c2565317e0cad5d1ca7e550c357"/>
     <w:p>
       <w:pPr>
         <w:pStyle w:val="Heading2"/>
       </w:pPr>
       <w:r>
-        <w:t xml:space="preserve">Application of the INSPECT-SR tool to assess an individual study</w:t>
+        <w:t xml:space="preserve">Application of the tool to assess an individual study</w:t>
       </w:r>
     </w:p>
     <w:p>
       <w:pPr>
         <w:pStyle w:val="FirstParagraph"/>
+      </w:pPr>
+      <w:hyperlink r:id="rId76">
+        <w:r>
+          <w:rPr>
+            <w:rStyle w:val="Hyperlink"/>
+          </w:rPr>
+          <w:t xml:space="preserve">Download template</w:t>
+        </w:r>
+      </w:hyperlink>
+    </w:p>
+    <w:p>
+      <w:pPr>
+        <w:pStyle w:val="BodyText"/>
       </w:pPr>
       <w:r>
         <w:t xml:space="preserve">Reviewers are advised to use the checks in each domain to arrive at a domain-level judgement about trustworthiness. The tool does not use a prescriptive algorithm to produce a domain-level judgement from the checks in the domain. For each domain, the reviewer records a judgement of</w:t>
@@ -3063,14 +3080,14 @@
         <w:t xml:space="preserve">A trial may be reported across several publications, including conference abstracts, preprints, protocol papers, and secondary analysis papers. As for Risk of Bias assessment, it will typically be necessary to consider all of the publications describing the trial to obtain the information necessary to complete the checks. The final check in the tool explicitly asks the reviewer to consider whether there are any contradictions in information reported in different publications relating to the index trial.</w:t>
       </w:r>
     </w:p>
-    <w:bookmarkEnd w:id="78"/>
-    <w:bookmarkStart w:id="80" w:name="X59bcbc5e4a03fc867a70cb4d43418964822f3ee"/>
+    <w:bookmarkEnd w:id="77"/>
+    <w:bookmarkStart w:id="79" w:name="Xcedb3f4cf71ab8ed200771edd1127b586677afd"/>
     <w:p>
       <w:pPr>
         <w:pStyle w:val="Heading2"/>
       </w:pPr>
       <w:r>
-        <w:t xml:space="preserve">Incorporating the INSPECT-SR tool into the systematic review process</w:t>
+        <w:t xml:space="preserve">Incorporating the tool into the systematic review process</w:t>
       </w:r>
     </w:p>
     <w:p>
@@ -3196,7 +3213,7 @@
       <w:r>
         <w:t xml:space="preserve"> </w:t>
       </w:r>
-      <w:hyperlink r:id="rId79">
+      <w:hyperlink r:id="rId78">
         <w:r>
           <w:rPr>
             <w:rStyle w:val="Hyperlink"/>
@@ -3208,8 +3225,8 @@
         <w:t xml:space="preserve">.</w:t>
       </w:r>
     </w:p>
-    <w:bookmarkEnd w:id="80"/>
-    <w:bookmarkStart w:id="85" w:name="Xf8c09140d43096fd5b8e1b398e336baceed5e9e"/>
+    <w:bookmarkEnd w:id="79"/>
+    <w:bookmarkStart w:id="84" w:name="Xf8c09140d43096fd5b8e1b398e336baceed5e9e"/>
     <w:p>
       <w:pPr>
         <w:pStyle w:val="Heading2"/>
@@ -3347,18 +3364,18 @@
           <wp:inline>
             <wp:extent cx="5943600" cy="2830285"/>
             <wp:effectExtent b="0" l="0" r="0" t="0"/>
-            <wp:docPr descr="Figure 1: Structure of the INSPECT-SR tool" title="" id="82" name="Picture"/>
+            <wp:docPr descr="Figure 1: Structure of the INSPECT-SR tool" title="" id="81" name="Picture"/>
             <a:graphic>
               <a:graphicData uri="http://schemas.openxmlformats.org/drawingml/2006/picture">
                 <pic:pic>
                   <pic:nvPicPr>
-                    <pic:cNvPr descr="images/structure.png" id="83" name="Picture"/>
+                    <pic:cNvPr descr="images/structure.png" id="82" name="Picture"/>
                     <pic:cNvPicPr>
                       <a:picLocks noChangeArrowheads="1" noChangeAspect="1"/>
                     </pic:cNvPicPr>
                   </pic:nvPicPr>
                   <pic:blipFill>
-                    <a:blip r:embed="rId81"/>
+                    <a:blip r:embed="rId80"/>
                     <a:stretch>
                       <a:fillRect/>
                     </a:stretch>
@@ -3423,7 +3440,7 @@
       <w:r>
         <w:t xml:space="preserve"> </w:t>
       </w:r>
-      <w:hyperlink r:id="rId84">
+      <w:hyperlink r:id="rId83">
         <w:r>
           <w:rPr>
             <w:rStyle w:val="Hyperlink"/>
@@ -3437,7 +3454,7 @@
       <w:r>
         <w:t xml:space="preserve"> </w:t>
       </w:r>
-      <w:hyperlink r:id="rId75">
+      <w:hyperlink r:id="rId25">
         <w:r>
           <w:rPr>
             <w:rStyle w:val="Hyperlink"/>
@@ -3449,8 +3466,160 @@
         <w:t xml:space="preserve">.</w:t>
       </w:r>
     </w:p>
-    <w:bookmarkEnd w:id="85"/>
-    <w:bookmarkStart w:id="91" w:name="resources"/>
+    <w:bookmarkEnd w:id="84"/>
+    <w:bookmarkStart w:id="87" w:name="license"/>
+    <w:p>
+      <w:pPr>
+        <w:pStyle w:val="Heading2"/>
+      </w:pPr>
+      <w:r>
+        <w:t xml:space="preserve">License</w:t>
+      </w:r>
+    </w:p>
+    <w:p>
+      <w:pPr>
+        <w:pStyle w:val="FirstParagraph"/>
+      </w:pPr>
+      <w:r>
+        <w:t xml:space="preserve">© Jack Wilkinson (2025-2026)</w:t>
+      </w:r>
+    </w:p>
+    <w:p>
+      <w:pPr>
+        <w:pStyle w:val="BodyText"/>
+      </w:pPr>
+      <w:r>
+        <w:t xml:space="preserve">Text and figures are licensed under a</w:t>
+      </w:r>
+      <w:r>
+        <w:t xml:space="preserve"> </w:t>
+      </w:r>
+      <w:hyperlink r:id="rId85">
+        <w:r>
+          <w:rPr>
+            <w:rStyle w:val="Hyperlink"/>
+          </w:rPr>
+          <w:t xml:space="preserve">Creative Commons Attribution 4.0 (CC BY 4.0)</w:t>
+        </w:r>
+      </w:hyperlink>
+      <w:r>
+        <w:t xml:space="preserve"> </w:t>
+      </w:r>
+      <w:r>
+        <w:t xml:space="preserve">license.</w:t>
+      </w:r>
+    </w:p>
+    <w:p>
+      <w:pPr>
+        <w:pStyle w:val="BodyText"/>
+      </w:pPr>
+      <w:r>
+        <w:t xml:space="preserve">Code is licensed under the</w:t>
+      </w:r>
+      <w:r>
+        <w:t xml:space="preserve"> </w:t>
+      </w:r>
+      <w:hyperlink r:id="rId86">
+        <w:r>
+          <w:rPr>
+            <w:rStyle w:val="Hyperlink"/>
+          </w:rPr>
+          <w:t xml:space="preserve">MIT License</w:t>
+        </w:r>
+      </w:hyperlink>
+      <w:r>
+        <w:t xml:space="preserve">.</w:t>
+      </w:r>
+    </w:p>
+    <w:p>
+      <w:pPr>
+        <w:pStyle w:val="BodyText"/>
+      </w:pPr>
+      <w:r>
+        <w:t xml:space="preserve">You are free to copy, share, adapt, and reuse the contents of this website — text, figures, and code — for any purpose, including commercial use, provided you cite it.</w:t>
+      </w:r>
+    </w:p>
+    <w:bookmarkEnd w:id="87"/>
+    <w:bookmarkStart w:id="91" w:name="source-code-and-archival"/>
+    <w:p>
+      <w:pPr>
+        <w:pStyle w:val="Heading2"/>
+      </w:pPr>
+      <w:r>
+        <w:t xml:space="preserve">Source code and archival</w:t>
+      </w:r>
+    </w:p>
+    <w:p>
+      <w:pPr>
+        <w:pStyle w:val="FirstParagraph"/>
+      </w:pPr>
+      <w:r>
+        <w:t xml:space="preserve">This site is maintained by Ian Hussey and Jack Wilkinson. If you find issues etc, you can open an issue or pull request on the</w:t>
+      </w:r>
+      <w:r>
+        <w:t xml:space="preserve"> </w:t>
+      </w:r>
+      <w:hyperlink r:id="rId88">
+        <w:r>
+          <w:rPr>
+            <w:rStyle w:val="Hyperlink"/>
+          </w:rPr>
+          <w:t xml:space="preserve">GitHub repository</w:t>
+        </w:r>
+      </w:hyperlink>
+      <w:r>
+        <w:t xml:space="preserve">. The GitHub repository is archived on</w:t>
+      </w:r>
+      <w:r>
+        <w:t xml:space="preserve"> </w:t>
+      </w:r>
+      <w:hyperlink r:id="rId89">
+        <w:r>
+          <w:rPr>
+            <w:rStyle w:val="Hyperlink"/>
+          </w:rPr>
+          <w:t xml:space="preserve">Zenodo</w:t>
+        </w:r>
+      </w:hyperlink>
+      <w:r>
+        <w:t xml:space="preserve">. Technically, this guidance document has its own DOI and reference, listed below, but please cite the INSPECT-SR publication itself (see Citation section above).</w:t>
+      </w:r>
+    </w:p>
+    <w:p>
+      <w:pPr>
+        <w:pStyle w:val="BodyText"/>
+      </w:pPr>
+      <w:r>
+        <w:t xml:space="preserve">Wilkinson, J., Bero, L., Heal, C., Flemyng, E., Antoniou, G. A., Aburrow, T., Alfirevic, Z., Avenell, A., Barbour, V., Berghella, V., Bishop, D. V. M., Bordewijk, E. M., Brown, N. J. L., Christopher, J., Clarke, M., Dahly, D., Dennis, J., Dicker, P., Dumville, J., Frankish, H., Grey, A., Grohmann, S., Gurrin, L. C., Hayden, J. A., Heathers, J., Hunter, K. E., Hussey, I., Jung, L., Lam, E., Lasserson, T. J., Lensen, S., Li, T., Li, W., Liu, J., Loder, E., Lundh, A., Meyerowitz-Katz, G., Mol, B. W., Naudet, F., Noel-Storr, A., O’Connell, N. E., Parker, L., Redberg, R. F., Redman, B. K., Richardson, R., Seidler, A. L., Sheldrick, K., Sydenham, E., van Wely, M., Vorland, C. J., Wang, R., Weibel, S., Wjst, M., &amp; Kirkham, J. J. (2026). INSPECT-SR Guidance. website:</w:t>
+      </w:r>
+      <w:r>
+        <w:t xml:space="preserve"> </w:t>
+      </w:r>
+      <w:hyperlink r:id="rId90">
+        <w:r>
+          <w:rPr>
+            <w:rStyle w:val="Hyperlink"/>
+          </w:rPr>
+          <w:t xml:space="preserve">inspect-sr.com</w:t>
+        </w:r>
+      </w:hyperlink>
+      <w:r>
+        <w:t xml:space="preserve">. doi:</w:t>
+      </w:r>
+      <w:r>
+        <w:t xml:space="preserve"> </w:t>
+      </w:r>
+      <w:hyperlink r:id="rId89">
+        <w:r>
+          <w:rPr>
+            <w:rStyle w:val="Hyperlink"/>
+          </w:rPr>
+          <w:t xml:space="preserve">10.5281/zenodo.21905597</w:t>
+        </w:r>
+      </w:hyperlink>
+    </w:p>
+    <w:bookmarkEnd w:id="91"/>
+    <w:bookmarkStart w:id="97" w:name="resources"/>
     <w:p>
       <w:pPr>
         <w:pStyle w:val="Heading2"/>
@@ -3464,10 +3633,10 @@
         <w:pStyle w:val="Compact"/>
         <w:numPr>
           <w:ilvl w:val="0"/>
-          <w:numId w:val="1001"/>
+          <w:numId w:val="1002"/>
         </w:numPr>
       </w:pPr>
-      <w:hyperlink r:id="rId86">
+      <w:hyperlink r:id="rId92">
         <w:r>
           <w:rPr>
             <w:rStyle w:val="Hyperlink"/>
@@ -3487,10 +3656,10 @@
         <w:pStyle w:val="Compact"/>
         <w:numPr>
           <w:ilvl w:val="0"/>
-          <w:numId w:val="1001"/>
+          <w:numId w:val="1002"/>
         </w:numPr>
       </w:pPr>
-      <w:hyperlink r:id="rId75">
+      <w:hyperlink r:id="rId25">
         <w:r>
           <w:rPr>
             <w:rStyle w:val="Hyperlink"/>
@@ -3510,10 +3679,10 @@
         <w:pStyle w:val="Compact"/>
         <w:numPr>
           <w:ilvl w:val="0"/>
-          <w:numId w:val="1001"/>
+          <w:numId w:val="1002"/>
         </w:numPr>
       </w:pPr>
-      <w:hyperlink r:id="rId87">
+      <w:hyperlink r:id="rId93">
         <w:r>
           <w:rPr>
             <w:rStyle w:val="Hyperlink"/>
@@ -3533,10 +3702,10 @@
         <w:pStyle w:val="Compact"/>
         <w:numPr>
           <w:ilvl w:val="0"/>
-          <w:numId w:val="1001"/>
+          <w:numId w:val="1002"/>
         </w:numPr>
       </w:pPr>
-      <w:hyperlink r:id="rId88">
+      <w:hyperlink r:id="rId94">
         <w:r>
           <w:rPr>
             <w:rStyle w:val="Hyperlink"/>
@@ -3556,10 +3725,10 @@
         <w:pStyle w:val="Compact"/>
         <w:numPr>
           <w:ilvl w:val="0"/>
-          <w:numId w:val="1001"/>
+          <w:numId w:val="1002"/>
         </w:numPr>
       </w:pPr>
-      <w:hyperlink r:id="rId79">
+      <w:hyperlink r:id="rId78">
         <w:r>
           <w:rPr>
             <w:rStyle w:val="Hyperlink"/>
@@ -3579,10 +3748,10 @@
         <w:pStyle w:val="Compact"/>
         <w:numPr>
           <w:ilvl w:val="0"/>
-          <w:numId w:val="1001"/>
+          <w:numId w:val="1002"/>
         </w:numPr>
       </w:pPr>
-      <w:hyperlink r:id="rId89">
+      <w:hyperlink r:id="rId95">
         <w:r>
           <w:rPr>
             <w:rStyle w:val="Hyperlink"/>
@@ -3602,10 +3771,10 @@
         <w:pStyle w:val="Compact"/>
         <w:numPr>
           <w:ilvl w:val="0"/>
-          <w:numId w:val="1001"/>
+          <w:numId w:val="1002"/>
         </w:numPr>
       </w:pPr>
-      <w:hyperlink r:id="rId90">
+      <w:hyperlink r:id="rId96">
         <w:r>
           <w:rPr>
             <w:rStyle w:val="Hyperlink"/>
@@ -3620,9 +3789,9 @@
         <w:t xml:space="preserve">— A hub for forensic meta-science tool development</w:t>
       </w:r>
     </w:p>
-    <w:bookmarkEnd w:id="91"/>
-    <w:bookmarkEnd w:id="92"/>
-    <w:bookmarkStart w:id="98" w:name="X1a801ee496a93cadedcfaff4a8913b82d495328"/>
+    <w:bookmarkEnd w:id="97"/>
+    <w:bookmarkEnd w:id="98"/>
+    <w:bookmarkStart w:id="104" w:name="X1a801ee496a93cadedcfaff4a8913b82d495328"/>
     <w:p>
       <w:pPr>
         <w:pStyle w:val="Heading1"/>
@@ -3673,7 +3842,7 @@
       <w:r>
         <w:t xml:space="preserve"> </w:t>
       </w:r>
-      <w:hyperlink r:id="rId87">
+      <w:hyperlink r:id="rId93">
         <w:r>
           <w:rPr>
             <w:rStyle w:val="Hyperlink"/>
@@ -3695,7 +3864,7 @@
       <w:r>
         <w:t xml:space="preserve"> </w:t>
       </w:r>
-      <w:hyperlink r:id="rId93">
+      <w:hyperlink r:id="rId99">
         <w:r>
           <w:rPr>
             <w:rStyle w:val="Hyperlink"/>
@@ -3754,7 +3923,7 @@
         <w:t xml:space="preserve">will typically be warranted, regardless of the reason for the retraction. An exception would be where a study has been retracted and subsequently replaced by a new version (e.g. to correct an error). The replacement can then be assessed using INSPECT-SR.</w:t>
       </w:r>
     </w:p>
-    <w:bookmarkStart w:id="97" w:name="example"/>
+    <w:bookmarkStart w:id="103" w:name="example"/>
     <w:p>
       <w:pPr>
         <w:pStyle w:val="Heading2"/>
@@ -3804,18 +3973,18 @@
                 <wp:inline>
                   <wp:extent cx="152400" cy="152400"/>
                   <wp:effectExtent b="0" l="0" r="0" t="0"/>
-                  <wp:docPr descr="" title="" id="95" name="Picture"/>
+                  <wp:docPr descr="" title="" id="101" name="Picture"/>
                   <a:graphic>
                     <a:graphicData uri="http://schemas.openxmlformats.org/drawingml/2006/picture">
                       <pic:pic>
                         <pic:nvPicPr>
-                          <pic:cNvPr descr="/Applications/quarto/share/formats/docx/note.png" id="96" name="Picture"/>
+                          <pic:cNvPr descr="/Applications/quarto/share/formats/docx/note.png" id="102" name="Picture"/>
                           <pic:cNvPicPr>
                             <a:picLocks noChangeArrowheads="1" noChangeAspect="1"/>
                           </pic:cNvPicPr>
                         </pic:nvPicPr>
                         <pic:blipFill>
-                          <a:blip r:embed="rId94"/>
+                          <a:blip r:embed="rId100"/>
                           <a:stretch>
                             <a:fillRect/>
                           </a:stretch>
@@ -3924,9 +4093,9 @@
         </w:tc>
       </w:tr>
     </w:tbl>
-    <w:bookmarkEnd w:id="97"/>
-    <w:bookmarkEnd w:id="98"/>
-    <w:bookmarkStart w:id="106" w:name="Xcbac9ff56f68b1fea35f8226a21256e8a88cfd0"/>
+    <w:bookmarkEnd w:id="103"/>
+    <w:bookmarkEnd w:id="104"/>
+    <w:bookmarkStart w:id="112" w:name="Xcbac9ff56f68b1fea35f8226a21256e8a88cfd0"/>
     <w:p>
       <w:pPr>
         <w:pStyle w:val="Heading1"/>
@@ -3975,7 +4144,7 @@
       <w:r>
         <w:t xml:space="preserve"> </w:t>
       </w:r>
-      <w:hyperlink r:id="rId87">
+      <w:hyperlink r:id="rId93">
         <w:r>
           <w:rPr>
             <w:rStyle w:val="Hyperlink"/>
@@ -3997,7 +4166,7 @@
       <w:r>
         <w:t xml:space="preserve"> </w:t>
       </w:r>
-      <w:hyperlink r:id="rId99">
+      <w:hyperlink r:id="rId105">
         <w:r>
           <w:rPr>
             <w:rStyle w:val="Hyperlink"/>
@@ -4019,7 +4188,7 @@
       <w:r>
         <w:t xml:space="preserve"> </w:t>
       </w:r>
-      <w:hyperlink r:id="rId93">
+      <w:hyperlink r:id="rId99">
         <w:r>
           <w:rPr>
             <w:rStyle w:val="Hyperlink"/>
@@ -4042,7 +4211,7 @@
         <w:t xml:space="preserve">The answer to this check should contribute to a domain-level judgement.</w:t>
       </w:r>
     </w:p>
-    <w:bookmarkStart w:id="105" w:name="examples"/>
+    <w:bookmarkStart w:id="111" w:name="examples"/>
     <w:p>
       <w:pPr>
         <w:pStyle w:val="Heading2"/>
@@ -4092,18 +4261,18 @@
                 <wp:inline>
                   <wp:extent cx="152400" cy="152400"/>
                   <wp:effectExtent b="0" l="0" r="0" t="0"/>
-                  <wp:docPr descr="" title="" id="100" name="Picture"/>
+                  <wp:docPr descr="" title="" id="106" name="Picture"/>
                   <a:graphic>
                     <a:graphicData uri="http://schemas.openxmlformats.org/drawingml/2006/picture">
                       <pic:pic>
                         <pic:nvPicPr>
-                          <pic:cNvPr descr="/Applications/quarto/share/formats/docx/note.png" id="101" name="Picture"/>
+                          <pic:cNvPr descr="/Applications/quarto/share/formats/docx/note.png" id="107" name="Picture"/>
                           <pic:cNvPicPr>
                             <a:picLocks noChangeArrowheads="1" noChangeAspect="1"/>
                           </pic:cNvPicPr>
                         </pic:nvPicPr>
                         <pic:blipFill>
-                          <a:blip r:embed="rId94"/>
+                          <a:blip r:embed="rId100"/>
                           <a:stretch>
                             <a:fillRect/>
                           </a:stretch>
@@ -4165,7 +4334,7 @@
             <w:r>
               <w:t xml:space="preserve"> </w:t>
             </w:r>
-            <w:hyperlink r:id="rId102">
+            <w:hyperlink r:id="rId108">
               <w:r>
                 <w:rPr>
                   <w:rStyle w:val="Hyperlink"/>
@@ -4266,18 +4435,18 @@
                 <wp:inline>
                   <wp:extent cx="152400" cy="152400"/>
                   <wp:effectExtent b="0" l="0" r="0" t="0"/>
-                  <wp:docPr descr="" title="" id="103" name="Picture"/>
+                  <wp:docPr descr="" title="" id="109" name="Picture"/>
                   <a:graphic>
                     <a:graphicData uri="http://schemas.openxmlformats.org/drawingml/2006/picture">
                       <pic:pic>
                         <pic:nvPicPr>
-                          <pic:cNvPr descr="/Applications/quarto/share/formats/docx/note.png" id="104" name="Picture"/>
+                          <pic:cNvPr descr="/Applications/quarto/share/formats/docx/note.png" id="110" name="Picture"/>
                           <pic:cNvPicPr>
                             <a:picLocks noChangeArrowheads="1" noChangeAspect="1"/>
                           </pic:cNvPicPr>
                         </pic:nvPicPr>
                         <pic:blipFill>
-                          <a:blip r:embed="rId94"/>
+                          <a:blip r:embed="rId100"/>
                           <a:stretch>
                             <a:fillRect/>
                           </a:stretch>
@@ -4353,9 +4522,9 @@
         </w:tc>
       </w:tr>
     </w:tbl>
-    <w:bookmarkEnd w:id="105"/>
-    <w:bookmarkEnd w:id="106"/>
-    <w:bookmarkStart w:id="112" w:name="Xf785ab274a85145118db61f0095e73700b942a7"/>
+    <w:bookmarkEnd w:id="111"/>
+    <w:bookmarkEnd w:id="112"/>
+    <w:bookmarkStart w:id="118" w:name="Xf785ab274a85145118db61f0095e73700b942a7"/>
     <w:p>
       <w:pPr>
         <w:pStyle w:val="Heading1"/>
@@ -4374,7 +4543,7 @@
       <w:r>
         <w:t xml:space="preserve"> </w:t>
       </w:r>
-      <w:hyperlink r:id="rId87">
+      <w:hyperlink r:id="rId93">
         <w:r>
           <w:rPr>
             <w:rStyle w:val="Hyperlink"/>
@@ -4434,7 +4603,7 @@
         <w:t xml:space="preserve">The answer to this check should contribute to a domain-level judgement.</w:t>
       </w:r>
     </w:p>
-    <w:bookmarkStart w:id="111" w:name="examples-1"/>
+    <w:bookmarkStart w:id="117" w:name="examples-1"/>
     <w:p>
       <w:pPr>
         <w:pStyle w:val="Heading2"/>
@@ -4484,18 +4653,18 @@
                 <wp:inline>
                   <wp:extent cx="152400" cy="152400"/>
                   <wp:effectExtent b="0" l="0" r="0" t="0"/>
-                  <wp:docPr descr="" title="" id="107" name="Picture"/>
+                  <wp:docPr descr="" title="" id="113" name="Picture"/>
                   <a:graphic>
                     <a:graphicData uri="http://schemas.openxmlformats.org/drawingml/2006/picture">
                       <pic:pic>
                         <pic:nvPicPr>
-                          <pic:cNvPr descr="/Applications/quarto/share/formats/docx/note.png" id="108" name="Picture"/>
+                          <pic:cNvPr descr="/Applications/quarto/share/formats/docx/note.png" id="114" name="Picture"/>
                           <pic:cNvPicPr>
                             <a:picLocks noChangeArrowheads="1" noChangeAspect="1"/>
                           </pic:cNvPicPr>
                         </pic:nvPicPr>
                         <pic:blipFill>
-                          <a:blip r:embed="rId94"/>
+                          <a:blip r:embed="rId100"/>
                           <a:stretch>
                             <a:fillRect/>
                           </a:stretch>
@@ -4557,7 +4726,7 @@
             <w:r>
               <w:t xml:space="preserve"> </w:t>
             </w:r>
-            <w:hyperlink r:id="rId87">
+            <w:hyperlink r:id="rId93">
               <w:r>
                 <w:rPr>
                   <w:rStyle w:val="Hyperlink"/>
@@ -4634,18 +4803,18 @@
                 <wp:inline>
                   <wp:extent cx="152400" cy="152400"/>
                   <wp:effectExtent b="0" l="0" r="0" t="0"/>
-                  <wp:docPr descr="" title="" id="109" name="Picture"/>
+                  <wp:docPr descr="" title="" id="115" name="Picture"/>
                   <a:graphic>
                     <a:graphicData uri="http://schemas.openxmlformats.org/drawingml/2006/picture">
                       <pic:pic>
                         <pic:nvPicPr>
-                          <pic:cNvPr descr="/Applications/quarto/share/formats/docx/note.png" id="110" name="Picture"/>
+                          <pic:cNvPr descr="/Applications/quarto/share/formats/docx/note.png" id="116" name="Picture"/>
                           <pic:cNvPicPr>
                             <a:picLocks noChangeArrowheads="1" noChangeAspect="1"/>
                           </pic:cNvPicPr>
                         </pic:nvPicPr>
                         <pic:blipFill>
-                          <a:blip r:embed="rId94"/>
+                          <a:blip r:embed="rId100"/>
                           <a:stretch>
                             <a:fillRect/>
                           </a:stretch>
@@ -4707,7 +4876,7 @@
             <w:r>
               <w:t xml:space="preserve"> </w:t>
             </w:r>
-            <w:hyperlink r:id="rId87">
+            <w:hyperlink r:id="rId93">
               <w:r>
                 <w:rPr>
                   <w:rStyle w:val="Hyperlink"/>
@@ -4735,9 +4904,9 @@
         </w:tc>
       </w:tr>
     </w:tbl>
-    <w:bookmarkEnd w:id="111"/>
-    <w:bookmarkEnd w:id="112"/>
-    <w:bookmarkStart w:id="116" w:name="X00dde75348e0a67f2c13cbc5d6f644fa1f13e11"/>
+    <w:bookmarkEnd w:id="117"/>
+    <w:bookmarkEnd w:id="118"/>
+    <w:bookmarkStart w:id="122" w:name="X00dde75348e0a67f2c13cbc5d6f644fa1f13e11"/>
     <w:p>
       <w:pPr>
         <w:pStyle w:val="Heading1"/>
@@ -4803,7 +4972,7 @@
         <w:t xml:space="preserve">The answer to this check should contribute to a domain-level judgement.</w:t>
       </w:r>
     </w:p>
-    <w:bookmarkStart w:id="115" w:name="example-1"/>
+    <w:bookmarkStart w:id="121" w:name="example-1"/>
     <w:p>
       <w:pPr>
         <w:pStyle w:val="Heading2"/>
@@ -4853,18 +5022,18 @@
                 <wp:inline>
                   <wp:extent cx="152400" cy="152400"/>
                   <wp:effectExtent b="0" l="0" r="0" t="0"/>
-                  <wp:docPr descr="" title="" id="113" name="Picture"/>
+                  <wp:docPr descr="" title="" id="119" name="Picture"/>
                   <a:graphic>
                     <a:graphicData uri="http://schemas.openxmlformats.org/drawingml/2006/picture">
                       <pic:pic>
                         <pic:nvPicPr>
-                          <pic:cNvPr descr="/Applications/quarto/share/formats/docx/note.png" id="114" name="Picture"/>
+                          <pic:cNvPr descr="/Applications/quarto/share/formats/docx/note.png" id="120" name="Picture"/>
                           <pic:cNvPicPr>
                             <a:picLocks noChangeArrowheads="1" noChangeAspect="1"/>
                           </pic:cNvPicPr>
                         </pic:nvPicPr>
                         <pic:blipFill>
-                          <a:blip r:embed="rId94"/>
+                          <a:blip r:embed="rId100"/>
                           <a:stretch>
                             <a:fillRect/>
                           </a:stretch>
@@ -4949,9 +5118,9 @@
         </w:tc>
       </w:tr>
     </w:tbl>
-    <w:bookmarkEnd w:id="115"/>
-    <w:bookmarkEnd w:id="116"/>
-    <w:bookmarkStart w:id="120" w:name="X21effb64d5040d96cfa8d3f206e4bd2c5f33b7d"/>
+    <w:bookmarkEnd w:id="121"/>
+    <w:bookmarkEnd w:id="122"/>
+    <w:bookmarkStart w:id="126" w:name="X21effb64d5040d96cfa8d3f206e4bd2c5f33b7d"/>
     <w:p>
       <w:pPr>
         <w:pStyle w:val="Heading1"/>
@@ -5022,7 +5191,7 @@
         <w:t xml:space="preserve">The answer to this check should contribute to a domain-level judgement.</w:t>
       </w:r>
     </w:p>
-    <w:bookmarkStart w:id="119" w:name="example-2"/>
+    <w:bookmarkStart w:id="125" w:name="example-2"/>
     <w:p>
       <w:pPr>
         <w:pStyle w:val="Heading2"/>
@@ -5072,18 +5241,18 @@
                 <wp:inline>
                   <wp:extent cx="152400" cy="152400"/>
                   <wp:effectExtent b="0" l="0" r="0" t="0"/>
-                  <wp:docPr descr="" title="" id="117" name="Picture"/>
+                  <wp:docPr descr="" title="" id="123" name="Picture"/>
                   <a:graphic>
                     <a:graphicData uri="http://schemas.openxmlformats.org/drawingml/2006/picture">
                       <pic:pic>
                         <pic:nvPicPr>
-                          <pic:cNvPr descr="/Applications/quarto/share/formats/docx/note.png" id="118" name="Picture"/>
+                          <pic:cNvPr descr="/Applications/quarto/share/formats/docx/note.png" id="124" name="Picture"/>
                           <pic:cNvPicPr>
                             <a:picLocks noChangeArrowheads="1" noChangeAspect="1"/>
                           </pic:cNvPicPr>
                         </pic:nvPicPr>
                         <pic:blipFill>
-                          <a:blip r:embed="rId94"/>
+                          <a:blip r:embed="rId100"/>
                           <a:stretch>
                             <a:fillRect/>
                           </a:stretch>
@@ -5159,9 +5328,9 @@
         </w:tc>
       </w:tr>
     </w:tbl>
-    <w:bookmarkEnd w:id="119"/>
-    <w:bookmarkEnd w:id="120"/>
-    <w:bookmarkStart w:id="124" w:name="Xb5f4946875e08b48d0ea3201a86db25f160f794"/>
+    <w:bookmarkEnd w:id="125"/>
+    <w:bookmarkEnd w:id="126"/>
+    <w:bookmarkStart w:id="130" w:name="Xb5f4946875e08b48d0ea3201a86db25f160f794"/>
     <w:p>
       <w:pPr>
         <w:pStyle w:val="Heading1"/>
@@ -5246,7 +5415,7 @@
         <w:t xml:space="preserve">The answer to this check should contribute to a domain-level judgement.</w:t>
       </w:r>
     </w:p>
-    <w:bookmarkStart w:id="123" w:name="example-3"/>
+    <w:bookmarkStart w:id="129" w:name="example-3"/>
     <w:p>
       <w:pPr>
         <w:pStyle w:val="Heading2"/>
@@ -5296,18 +5465,18 @@
                 <wp:inline>
                   <wp:extent cx="152400" cy="152400"/>
                   <wp:effectExtent b="0" l="0" r="0" t="0"/>
-                  <wp:docPr descr="" title="" id="121" name="Picture"/>
+                  <wp:docPr descr="" title="" id="127" name="Picture"/>
                   <a:graphic>
                     <a:graphicData uri="http://schemas.openxmlformats.org/drawingml/2006/picture">
                       <pic:pic>
                         <pic:nvPicPr>
-                          <pic:cNvPr descr="/Applications/quarto/share/formats/docx/note.png" id="122" name="Picture"/>
+                          <pic:cNvPr descr="/Applications/quarto/share/formats/docx/note.png" id="128" name="Picture"/>
                           <pic:cNvPicPr>
                             <a:picLocks noChangeArrowheads="1" noChangeAspect="1"/>
                           </pic:cNvPicPr>
                         </pic:nvPicPr>
                         <pic:blipFill>
-                          <a:blip r:embed="rId94"/>
+                          <a:blip r:embed="rId100"/>
                           <a:stretch>
                             <a:fillRect/>
                           </a:stretch>
@@ -5383,9 +5552,9 @@
         </w:tc>
       </w:tr>
     </w:tbl>
-    <w:bookmarkEnd w:id="123"/>
-    <w:bookmarkEnd w:id="124"/>
-    <w:bookmarkStart w:id="130" w:name="X15ad5a5755ad409d93f671ddbb71949aa6201d5"/>
+    <w:bookmarkEnd w:id="129"/>
+    <w:bookmarkEnd w:id="130"/>
+    <w:bookmarkStart w:id="136" w:name="X15ad5a5755ad409d93f671ddbb71949aa6201d5"/>
     <w:p>
       <w:pPr>
         <w:pStyle w:val="Heading1"/>
@@ -5434,7 +5603,7 @@
         <w:t xml:space="preserve">The answer to this check should contribute to a domain-level judgement.</w:t>
       </w:r>
     </w:p>
-    <w:bookmarkStart w:id="129" w:name="examples-2"/>
+    <w:bookmarkStart w:id="135" w:name="examples-2"/>
     <w:p>
       <w:pPr>
         <w:pStyle w:val="Heading2"/>
@@ -5484,18 +5653,18 @@
                 <wp:inline>
                   <wp:extent cx="152400" cy="152400"/>
                   <wp:effectExtent b="0" l="0" r="0" t="0"/>
-                  <wp:docPr descr="" title="" id="125" name="Picture"/>
+                  <wp:docPr descr="" title="" id="131" name="Picture"/>
                   <a:graphic>
                     <a:graphicData uri="http://schemas.openxmlformats.org/drawingml/2006/picture">
                       <pic:pic>
                         <pic:nvPicPr>
-                          <pic:cNvPr descr="/Applications/quarto/share/formats/docx/note.png" id="126" name="Picture"/>
+                          <pic:cNvPr descr="/Applications/quarto/share/formats/docx/note.png" id="132" name="Picture"/>
                           <pic:cNvPicPr>
                             <a:picLocks noChangeArrowheads="1" noChangeAspect="1"/>
                           </pic:cNvPicPr>
                         </pic:nvPicPr>
                         <pic:blipFill>
-                          <a:blip r:embed="rId94"/>
+                          <a:blip r:embed="rId100"/>
                           <a:stretch>
                             <a:fillRect/>
                           </a:stretch>
@@ -5620,18 +5789,18 @@
                 <wp:inline>
                   <wp:extent cx="152400" cy="152400"/>
                   <wp:effectExtent b="0" l="0" r="0" t="0"/>
-                  <wp:docPr descr="" title="" id="127" name="Picture"/>
+                  <wp:docPr descr="" title="" id="133" name="Picture"/>
                   <a:graphic>
                     <a:graphicData uri="http://schemas.openxmlformats.org/drawingml/2006/picture">
                       <pic:pic>
                         <pic:nvPicPr>
-                          <pic:cNvPr descr="/Applications/quarto/share/formats/docx/note.png" id="128" name="Picture"/>
+                          <pic:cNvPr descr="/Applications/quarto/share/formats/docx/note.png" id="134" name="Picture"/>
                           <pic:cNvPicPr>
                             <a:picLocks noChangeArrowheads="1" noChangeAspect="1"/>
                           </pic:cNvPicPr>
                         </pic:nvPicPr>
                         <pic:blipFill>
-                          <a:blip r:embed="rId94"/>
+                          <a:blip r:embed="rId100"/>
                           <a:stretch>
                             <a:fillRect/>
                           </a:stretch>
@@ -5707,9 +5876,9 @@
         </w:tc>
       </w:tr>
     </w:tbl>
-    <w:bookmarkEnd w:id="129"/>
-    <w:bookmarkEnd w:id="130"/>
-    <w:bookmarkStart w:id="136" w:name="X94bba58062de1951d3a507e9ea22a5fb9808d0b"/>
+    <w:bookmarkEnd w:id="135"/>
+    <w:bookmarkEnd w:id="136"/>
+    <w:bookmarkStart w:id="142" w:name="X94bba58062de1951d3a507e9ea22a5fb9808d0b"/>
     <w:p>
       <w:pPr>
         <w:pStyle w:val="Heading1"/>
@@ -5750,7 +5919,7 @@
         <w:t xml:space="preserve">The answer to this check should contribute to a domain-level judgement.</w:t>
       </w:r>
     </w:p>
-    <w:bookmarkStart w:id="135" w:name="examples-3"/>
+    <w:bookmarkStart w:id="141" w:name="examples-3"/>
     <w:p>
       <w:pPr>
         <w:pStyle w:val="Heading2"/>
@@ -5800,18 +5969,18 @@
                 <wp:inline>
                   <wp:extent cx="152400" cy="152400"/>
                   <wp:effectExtent b="0" l="0" r="0" t="0"/>
-                  <wp:docPr descr="" title="" id="131" name="Picture"/>
+                  <wp:docPr descr="" title="" id="137" name="Picture"/>
                   <a:graphic>
                     <a:graphicData uri="http://schemas.openxmlformats.org/drawingml/2006/picture">
                       <pic:pic>
                         <pic:nvPicPr>
-                          <pic:cNvPr descr="/Applications/quarto/share/formats/docx/note.png" id="132" name="Picture"/>
+                          <pic:cNvPr descr="/Applications/quarto/share/formats/docx/note.png" id="138" name="Picture"/>
                           <pic:cNvPicPr>
                             <a:picLocks noChangeArrowheads="1" noChangeAspect="1"/>
                           </pic:cNvPicPr>
                         </pic:nvPicPr>
                         <pic:blipFill>
-                          <a:blip r:embed="rId94"/>
+                          <a:blip r:embed="rId100"/>
                           <a:stretch>
                             <a:fillRect/>
                           </a:stretch>
@@ -5936,18 +6105,18 @@
                 <wp:inline>
                   <wp:extent cx="152400" cy="152400"/>
                   <wp:effectExtent b="0" l="0" r="0" t="0"/>
-                  <wp:docPr descr="" title="" id="133" name="Picture"/>
+                  <wp:docPr descr="" title="" id="139" name="Picture"/>
                   <a:graphic>
                     <a:graphicData uri="http://schemas.openxmlformats.org/drawingml/2006/picture">
                       <pic:pic>
                         <pic:nvPicPr>
-                          <pic:cNvPr descr="/Applications/quarto/share/formats/docx/note.png" id="134" name="Picture"/>
+                          <pic:cNvPr descr="/Applications/quarto/share/formats/docx/note.png" id="140" name="Picture"/>
                           <pic:cNvPicPr>
                             <a:picLocks noChangeArrowheads="1" noChangeAspect="1"/>
                           </pic:cNvPicPr>
                         </pic:nvPicPr>
                         <pic:blipFill>
-                          <a:blip r:embed="rId94"/>
+                          <a:blip r:embed="rId100"/>
                           <a:stretch>
                             <a:fillRect/>
                           </a:stretch>
@@ -6023,9 +6192,9 @@
         </w:tc>
       </w:tr>
     </w:tbl>
-    <w:bookmarkEnd w:id="135"/>
-    <w:bookmarkEnd w:id="136"/>
-    <w:bookmarkStart w:id="140" w:name="X8121634ca53ee6fe6e673bcd39373968123162a"/>
+    <w:bookmarkEnd w:id="141"/>
+    <w:bookmarkEnd w:id="142"/>
+    <w:bookmarkStart w:id="146" w:name="X8121634ca53ee6fe6e673bcd39373968123162a"/>
     <w:p>
       <w:pPr>
         <w:pStyle w:val="Heading1"/>
@@ -6132,7 +6301,7 @@
         <w:t xml:space="preserve">The answer to this check should contribute to a domain-level judgement.</w:t>
       </w:r>
     </w:p>
-    <w:bookmarkStart w:id="139" w:name="example-4"/>
+    <w:bookmarkStart w:id="145" w:name="example-4"/>
     <w:p>
       <w:pPr>
         <w:pStyle w:val="Heading2"/>
@@ -6182,18 +6351,18 @@
                 <wp:inline>
                   <wp:extent cx="152400" cy="152400"/>
                   <wp:effectExtent b="0" l="0" r="0" t="0"/>
-                  <wp:docPr descr="" title="" id="137" name="Picture"/>
+                  <wp:docPr descr="" title="" id="143" name="Picture"/>
                   <a:graphic>
                     <a:graphicData uri="http://schemas.openxmlformats.org/drawingml/2006/picture">
                       <pic:pic>
                         <pic:nvPicPr>
-                          <pic:cNvPr descr="/Applications/quarto/share/formats/docx/note.png" id="138" name="Picture"/>
+                          <pic:cNvPr descr="/Applications/quarto/share/formats/docx/note.png" id="144" name="Picture"/>
                           <pic:cNvPicPr>
                             <a:picLocks noChangeArrowheads="1" noChangeAspect="1"/>
                           </pic:cNvPicPr>
                         </pic:nvPicPr>
                         <pic:blipFill>
-                          <a:blip r:embed="rId94"/>
+                          <a:blip r:embed="rId100"/>
                           <a:stretch>
                             <a:fillRect/>
                           </a:stretch>
@@ -6269,9 +6438,9 @@
         </w:tc>
       </w:tr>
     </w:tbl>
-    <w:bookmarkEnd w:id="139"/>
-    <w:bookmarkEnd w:id="140"/>
-    <w:bookmarkStart w:id="144" w:name="X777b9478ff09da66e54e18f690437a9430eac35"/>
+    <w:bookmarkEnd w:id="145"/>
+    <w:bookmarkEnd w:id="146"/>
+    <w:bookmarkStart w:id="150" w:name="X777b9478ff09da66e54e18f690437a9430eac35"/>
     <w:p>
       <w:pPr>
         <w:pStyle w:val="Heading1"/>
@@ -6316,7 +6485,7 @@
         <w:t xml:space="preserve">The answer to this check should contribute to a domain-level judgement.</w:t>
       </w:r>
     </w:p>
-    <w:bookmarkStart w:id="143" w:name="example-5"/>
+    <w:bookmarkStart w:id="149" w:name="example-5"/>
     <w:p>
       <w:pPr>
         <w:pStyle w:val="Heading2"/>
@@ -6366,18 +6535,18 @@
                 <wp:inline>
                   <wp:extent cx="152400" cy="152400"/>
                   <wp:effectExtent b="0" l="0" r="0" t="0"/>
-                  <wp:docPr descr="" title="" id="141" name="Picture"/>
+                  <wp:docPr descr="" title="" id="147" name="Picture"/>
                   <a:graphic>
                     <a:graphicData uri="http://schemas.openxmlformats.org/drawingml/2006/picture">
                       <pic:pic>
                         <pic:nvPicPr>
-                          <pic:cNvPr descr="/Applications/quarto/share/formats/docx/note.png" id="142" name="Picture"/>
+                          <pic:cNvPr descr="/Applications/quarto/share/formats/docx/note.png" id="148" name="Picture"/>
                           <pic:cNvPicPr>
                             <a:picLocks noChangeArrowheads="1" noChangeAspect="1"/>
                           </pic:cNvPicPr>
                         </pic:nvPicPr>
                         <pic:blipFill>
-                          <a:blip r:embed="rId94"/>
+                          <a:blip r:embed="rId100"/>
                           <a:stretch>
                             <a:fillRect/>
                           </a:stretch>
@@ -6453,9 +6622,9 @@
         </w:tc>
       </w:tr>
     </w:tbl>
-    <w:bookmarkEnd w:id="143"/>
-    <w:bookmarkEnd w:id="144"/>
-    <w:bookmarkStart w:id="148" w:name="X226bb196e60a36bf3967425fd08f7728284bf67"/>
+    <w:bookmarkEnd w:id="149"/>
+    <w:bookmarkEnd w:id="150"/>
+    <w:bookmarkStart w:id="154" w:name="X226bb196e60a36bf3967425fd08f7728284bf67"/>
     <w:p>
       <w:pPr>
         <w:pStyle w:val="Heading1"/>
@@ -6488,7 +6657,7 @@
         <w:t xml:space="preserve">The answer to this check should contribute to a domain-level judgement.</w:t>
       </w:r>
     </w:p>
-    <w:bookmarkStart w:id="147" w:name="example-6"/>
+    <w:bookmarkStart w:id="153" w:name="example-6"/>
     <w:p>
       <w:pPr>
         <w:pStyle w:val="Heading2"/>
@@ -6538,18 +6707,18 @@
                 <wp:inline>
                   <wp:extent cx="152400" cy="152400"/>
                   <wp:effectExtent b="0" l="0" r="0" t="0"/>
-                  <wp:docPr descr="" title="" id="145" name="Picture"/>
+                  <wp:docPr descr="" title="" id="151" name="Picture"/>
                   <a:graphic>
                     <a:graphicData uri="http://schemas.openxmlformats.org/drawingml/2006/picture">
                       <pic:pic>
                         <pic:nvPicPr>
-                          <pic:cNvPr descr="/Applications/quarto/share/formats/docx/note.png" id="146" name="Picture"/>
+                          <pic:cNvPr descr="/Applications/quarto/share/formats/docx/note.png" id="152" name="Picture"/>
                           <pic:cNvPicPr>
                             <a:picLocks noChangeArrowheads="1" noChangeAspect="1"/>
                           </pic:cNvPicPr>
                         </pic:nvPicPr>
                         <pic:blipFill>
-                          <a:blip r:embed="rId94"/>
+                          <a:blip r:embed="rId100"/>
                           <a:stretch>
                             <a:fillRect/>
                           </a:stretch>
@@ -6625,9 +6794,9 @@
         </w:tc>
       </w:tr>
     </w:tbl>
-    <w:bookmarkEnd w:id="147"/>
-    <w:bookmarkEnd w:id="148"/>
-    <w:bookmarkStart w:id="152" w:name="X4be0e0b67fc78de22ede51835527412ee3ea986"/>
+    <w:bookmarkEnd w:id="153"/>
+    <w:bookmarkEnd w:id="154"/>
+    <w:bookmarkStart w:id="158" w:name="X4be0e0b67fc78de22ede51835527412ee3ea986"/>
     <w:p>
       <w:pPr>
         <w:pStyle w:val="Heading1"/>
@@ -6684,7 +6853,7 @@
         <w:t xml:space="preserve">The answer to this check should contribute to a domain-level judgement.</w:t>
       </w:r>
     </w:p>
-    <w:bookmarkStart w:id="151" w:name="example-7"/>
+    <w:bookmarkStart w:id="157" w:name="example-7"/>
     <w:p>
       <w:pPr>
         <w:pStyle w:val="Heading2"/>
@@ -6734,18 +6903,18 @@
                 <wp:inline>
                   <wp:extent cx="152400" cy="152400"/>
                   <wp:effectExtent b="0" l="0" r="0" t="0"/>
-                  <wp:docPr descr="" title="" id="149" name="Picture"/>
+                  <wp:docPr descr="" title="" id="155" name="Picture"/>
                   <a:graphic>
                     <a:graphicData uri="http://schemas.openxmlformats.org/drawingml/2006/picture">
                       <pic:pic>
                         <pic:nvPicPr>
-                          <pic:cNvPr descr="/Applications/quarto/share/formats/docx/note.png" id="150" name="Picture"/>
+                          <pic:cNvPr descr="/Applications/quarto/share/formats/docx/note.png" id="156" name="Picture"/>
                           <pic:cNvPicPr>
                             <a:picLocks noChangeArrowheads="1" noChangeAspect="1"/>
                           </pic:cNvPicPr>
                         </pic:nvPicPr>
                         <pic:blipFill>
-                          <a:blip r:embed="rId94"/>
+                          <a:blip r:embed="rId100"/>
                           <a:stretch>
                             <a:fillRect/>
                           </a:stretch>
@@ -6821,9 +6990,9 @@
         </w:tc>
       </w:tr>
     </w:tbl>
-    <w:bookmarkEnd w:id="151"/>
-    <w:bookmarkEnd w:id="152"/>
-    <w:bookmarkStart w:id="156" w:name="are-any-baseline-data-implausible"/>
+    <w:bookmarkEnd w:id="157"/>
+    <w:bookmarkEnd w:id="158"/>
+    <w:bookmarkStart w:id="162" w:name="are-any-baseline-data-implausible"/>
     <w:p>
       <w:pPr>
         <w:pStyle w:val="Heading1"/>
@@ -6919,7 +7088,7 @@
         <w:t xml:space="preserve">The answer to this check should contribute to a domain-level judgement.</w:t>
       </w:r>
     </w:p>
-    <w:bookmarkStart w:id="155" w:name="example-8"/>
+    <w:bookmarkStart w:id="161" w:name="example-8"/>
     <w:p>
       <w:pPr>
         <w:pStyle w:val="Heading2"/>
@@ -6969,18 +7138,18 @@
                 <wp:inline>
                   <wp:extent cx="152400" cy="152400"/>
                   <wp:effectExtent b="0" l="0" r="0" t="0"/>
-                  <wp:docPr descr="" title="" id="153" name="Picture"/>
+                  <wp:docPr descr="" title="" id="159" name="Picture"/>
                   <a:graphic>
                     <a:graphicData uri="http://schemas.openxmlformats.org/drawingml/2006/picture">
                       <pic:pic>
                         <pic:nvPicPr>
-                          <pic:cNvPr descr="/Applications/quarto/share/formats/docx/note.png" id="154" name="Picture"/>
+                          <pic:cNvPr descr="/Applications/quarto/share/formats/docx/note.png" id="160" name="Picture"/>
                           <pic:cNvPicPr>
                             <a:picLocks noChangeArrowheads="1" noChangeAspect="1"/>
                           </pic:cNvPicPr>
                         </pic:nvPicPr>
                         <pic:blipFill>
-                          <a:blip r:embed="rId94"/>
+                          <a:blip r:embed="rId100"/>
                           <a:stretch>
                             <a:fillRect/>
                           </a:stretch>
@@ -7056,9 +7225,9 @@
         </w:tc>
       </w:tr>
     </w:tbl>
-    <w:bookmarkEnd w:id="155"/>
-    <w:bookmarkEnd w:id="156"/>
-    <w:bookmarkStart w:id="160" w:name="X25a20c042d22525a31eac1cb852ca92a58452bc"/>
+    <w:bookmarkEnd w:id="161"/>
+    <w:bookmarkEnd w:id="162"/>
+    <w:bookmarkStart w:id="166" w:name="X25a20c042d22525a31eac1cb852ca92a58452bc"/>
     <w:p>
       <w:pPr>
         <w:pStyle w:val="Heading1"/>
@@ -7091,7 +7260,7 @@
         <w:t xml:space="preserve">The answer to this check should contribute to a domain-level judgement.</w:t>
       </w:r>
     </w:p>
-    <w:bookmarkStart w:id="159" w:name="example-9"/>
+    <w:bookmarkStart w:id="165" w:name="example-9"/>
     <w:p>
       <w:pPr>
         <w:pStyle w:val="Heading2"/>
@@ -7141,18 +7310,18 @@
                 <wp:inline>
                   <wp:extent cx="152400" cy="152400"/>
                   <wp:effectExtent b="0" l="0" r="0" t="0"/>
-                  <wp:docPr descr="" title="" id="157" name="Picture"/>
+                  <wp:docPr descr="" title="" id="163" name="Picture"/>
                   <a:graphic>
                     <a:graphicData uri="http://schemas.openxmlformats.org/drawingml/2006/picture">
                       <pic:pic>
                         <pic:nvPicPr>
-                          <pic:cNvPr descr="/Applications/quarto/share/formats/docx/note.png" id="158" name="Picture"/>
+                          <pic:cNvPr descr="/Applications/quarto/share/formats/docx/note.png" id="164" name="Picture"/>
                           <pic:cNvPicPr>
                             <a:picLocks noChangeArrowheads="1" noChangeAspect="1"/>
                           </pic:cNvPicPr>
                         </pic:nvPicPr>
                         <pic:blipFill>
-                          <a:blip r:embed="rId94"/>
+                          <a:blip r:embed="rId100"/>
                           <a:stretch>
                             <a:fillRect/>
                           </a:stretch>
@@ -7228,9 +7397,9 @@
         </w:tc>
       </w:tr>
     </w:tbl>
-    <w:bookmarkEnd w:id="159"/>
-    <w:bookmarkEnd w:id="160"/>
-    <w:bookmarkStart w:id="164" w:name="X61041f28989a5214f0f0b0f95b600aa575f6ded"/>
+    <w:bookmarkEnd w:id="165"/>
+    <w:bookmarkEnd w:id="166"/>
+    <w:bookmarkStart w:id="170" w:name="X61041f28989a5214f0f0b0f95b600aa575f6ded"/>
     <w:p>
       <w:pPr>
         <w:pStyle w:val="Heading1"/>
@@ -7279,7 +7448,7 @@
         <w:t xml:space="preserve">The answer to this check should contribute to a domain-level judgement.</w:t>
       </w:r>
     </w:p>
-    <w:bookmarkStart w:id="163" w:name="example-10"/>
+    <w:bookmarkStart w:id="169" w:name="example-10"/>
     <w:p>
       <w:pPr>
         <w:pStyle w:val="Heading2"/>
@@ -7329,18 +7498,18 @@
                 <wp:inline>
                   <wp:extent cx="152400" cy="152400"/>
                   <wp:effectExtent b="0" l="0" r="0" t="0"/>
-                  <wp:docPr descr="" title="" id="161" name="Picture"/>
+                  <wp:docPr descr="" title="" id="167" name="Picture"/>
                   <a:graphic>
                     <a:graphicData uri="http://schemas.openxmlformats.org/drawingml/2006/picture">
                       <pic:pic>
                         <pic:nvPicPr>
-                          <pic:cNvPr descr="/Applications/quarto/share/formats/docx/note.png" id="162" name="Picture"/>
+                          <pic:cNvPr descr="/Applications/quarto/share/formats/docx/note.png" id="168" name="Picture"/>
                           <pic:cNvPicPr>
                             <a:picLocks noChangeArrowheads="1" noChangeAspect="1"/>
                           </pic:cNvPicPr>
                         </pic:nvPicPr>
                         <pic:blipFill>
-                          <a:blip r:embed="rId94"/>
+                          <a:blip r:embed="rId100"/>
                           <a:stretch>
                             <a:fillRect/>
                           </a:stretch>
@@ -7416,9 +7585,9 @@
         </w:tc>
       </w:tr>
     </w:tbl>
-    <w:bookmarkEnd w:id="163"/>
-    <w:bookmarkEnd w:id="164"/>
-    <w:bookmarkStart w:id="170" w:name="Xe4229ef5f67d8179aec02cdd776641712e0ed09"/>
+    <w:bookmarkEnd w:id="169"/>
+    <w:bookmarkEnd w:id="170"/>
+    <w:bookmarkStart w:id="176" w:name="Xe4229ef5f67d8179aec02cdd776641712e0ed09"/>
     <w:p>
       <w:pPr>
         <w:pStyle w:val="Heading1"/>
@@ -7479,7 +7648,7 @@
         <w:t xml:space="preserve">The answer to this check should contribute to a domain-level judgement.</w:t>
       </w:r>
     </w:p>
-    <w:bookmarkStart w:id="169" w:name="examples-4"/>
+    <w:bookmarkStart w:id="175" w:name="examples-4"/>
     <w:p>
       <w:pPr>
         <w:pStyle w:val="Heading2"/>
@@ -7529,18 +7698,18 @@
                 <wp:inline>
                   <wp:extent cx="152400" cy="152400"/>
                   <wp:effectExtent b="0" l="0" r="0" t="0"/>
-                  <wp:docPr descr="" title="" id="165" name="Picture"/>
+                  <wp:docPr descr="" title="" id="171" name="Picture"/>
                   <a:graphic>
                     <a:graphicData uri="http://schemas.openxmlformats.org/drawingml/2006/picture">
                       <pic:pic>
                         <pic:nvPicPr>
-                          <pic:cNvPr descr="/Applications/quarto/share/formats/docx/note.png" id="166" name="Picture"/>
+                          <pic:cNvPr descr="/Applications/quarto/share/formats/docx/note.png" id="172" name="Picture"/>
                           <pic:cNvPicPr>
                             <a:picLocks noChangeArrowheads="1" noChangeAspect="1"/>
                           </pic:cNvPicPr>
                         </pic:nvPicPr>
                         <pic:blipFill>
-                          <a:blip r:embed="rId94"/>
+                          <a:blip r:embed="rId100"/>
                           <a:stretch>
                             <a:fillRect/>
                           </a:stretch>
@@ -7665,18 +7834,18 @@
                 <wp:inline>
                   <wp:extent cx="152400" cy="152400"/>
                   <wp:effectExtent b="0" l="0" r="0" t="0"/>
-                  <wp:docPr descr="" title="" id="167" name="Picture"/>
+                  <wp:docPr descr="" title="" id="173" name="Picture"/>
                   <a:graphic>
                     <a:graphicData uri="http://schemas.openxmlformats.org/drawingml/2006/picture">
                       <pic:pic>
                         <pic:nvPicPr>
-                          <pic:cNvPr descr="/Applications/quarto/share/formats/docx/note.png" id="168" name="Picture"/>
+                          <pic:cNvPr descr="/Applications/quarto/share/formats/docx/note.png" id="174" name="Picture"/>
                           <pic:cNvPicPr>
                             <a:picLocks noChangeArrowheads="1" noChangeAspect="1"/>
                           </pic:cNvPicPr>
                         </pic:nvPicPr>
                         <pic:blipFill>
-                          <a:blip r:embed="rId94"/>
+                          <a:blip r:embed="rId100"/>
                           <a:stretch>
                             <a:fillRect/>
                           </a:stretch>
@@ -7752,9 +7921,9 @@
         </w:tc>
       </w:tr>
     </w:tbl>
-    <w:bookmarkEnd w:id="169"/>
-    <w:bookmarkEnd w:id="170"/>
-    <w:bookmarkStart w:id="176" w:name="Xef4b87152a03152282801c067c09980a582d182"/>
+    <w:bookmarkEnd w:id="175"/>
+    <w:bookmarkEnd w:id="176"/>
+    <w:bookmarkStart w:id="182" w:name="Xef4b87152a03152282801c067c09980a582d182"/>
     <w:p>
       <w:pPr>
         <w:pStyle w:val="Heading1"/>
@@ -7841,7 +8010,7 @@
         <w:t xml:space="preserve">The answer to this check should contribute to a domain-level judgement.</w:t>
       </w:r>
     </w:p>
-    <w:bookmarkStart w:id="175" w:name="examples-5"/>
+    <w:bookmarkStart w:id="181" w:name="examples-5"/>
     <w:p>
       <w:pPr>
         <w:pStyle w:val="Heading2"/>
@@ -7891,18 +8060,18 @@
                 <wp:inline>
                   <wp:extent cx="152400" cy="152400"/>
                   <wp:effectExtent b="0" l="0" r="0" t="0"/>
-                  <wp:docPr descr="" title="" id="171" name="Picture"/>
+                  <wp:docPr descr="" title="" id="177" name="Picture"/>
                   <a:graphic>
                     <a:graphicData uri="http://schemas.openxmlformats.org/drawingml/2006/picture">
                       <pic:pic>
                         <pic:nvPicPr>
-                          <pic:cNvPr descr="/Applications/quarto/share/formats/docx/note.png" id="172" name="Picture"/>
+                          <pic:cNvPr descr="/Applications/quarto/share/formats/docx/note.png" id="178" name="Picture"/>
                           <pic:cNvPicPr>
                             <a:picLocks noChangeArrowheads="1" noChangeAspect="1"/>
                           </pic:cNvPicPr>
                         </pic:nvPicPr>
                         <pic:blipFill>
-                          <a:blip r:embed="rId94"/>
+                          <a:blip r:embed="rId100"/>
                           <a:stretch>
                             <a:fillRect/>
                           </a:stretch>
@@ -8027,18 +8196,18 @@
                 <wp:inline>
                   <wp:extent cx="152400" cy="152400"/>
                   <wp:effectExtent b="0" l="0" r="0" t="0"/>
-                  <wp:docPr descr="" title="" id="173" name="Picture"/>
+                  <wp:docPr descr="" title="" id="179" name="Picture"/>
                   <a:graphic>
                     <a:graphicData uri="http://schemas.openxmlformats.org/drawingml/2006/picture">
                       <pic:pic>
                         <pic:nvPicPr>
-                          <pic:cNvPr descr="/Applications/quarto/share/formats/docx/note.png" id="174" name="Picture"/>
+                          <pic:cNvPr descr="/Applications/quarto/share/formats/docx/note.png" id="180" name="Picture"/>
                           <pic:cNvPicPr>
                             <a:picLocks noChangeArrowheads="1" noChangeAspect="1"/>
                           </pic:cNvPicPr>
                         </pic:nvPicPr>
                         <pic:blipFill>
-                          <a:blip r:embed="rId94"/>
+                          <a:blip r:embed="rId100"/>
                           <a:stretch>
                             <a:fillRect/>
                           </a:stretch>
@@ -8114,9 +8283,9 @@
         </w:tc>
       </w:tr>
     </w:tbl>
-    <w:bookmarkEnd w:id="175"/>
-    <w:bookmarkEnd w:id="176"/>
-    <w:bookmarkStart w:id="183" w:name="X9a1ed448c1dc57e23cf47ea622e135bc32559f3"/>
+    <w:bookmarkEnd w:id="181"/>
+    <w:bookmarkEnd w:id="182"/>
+    <w:bookmarkStart w:id="191" w:name="X9a1ed448c1dc57e23cf47ea622e135bc32559f3"/>
     <w:p>
       <w:pPr>
         <w:pStyle w:val="Heading1"/>
@@ -8189,7 +8358,7 @@
         <w:t xml:space="preserve">The answer to this check should contribute to a domain-level judgement.</w:t>
       </w:r>
     </w:p>
-    <w:bookmarkStart w:id="179" w:name="example-11"/>
+    <w:bookmarkStart w:id="185" w:name="example-11"/>
     <w:p>
       <w:pPr>
         <w:pStyle w:val="Heading2"/>
@@ -8239,18 +8408,18 @@
                 <wp:inline>
                   <wp:extent cx="152400" cy="152400"/>
                   <wp:effectExtent b="0" l="0" r="0" t="0"/>
-                  <wp:docPr descr="" title="" id="177" name="Picture"/>
+                  <wp:docPr descr="" title="" id="183" name="Picture"/>
                   <a:graphic>
                     <a:graphicData uri="http://schemas.openxmlformats.org/drawingml/2006/picture">
                       <pic:pic>
                         <pic:nvPicPr>
-                          <pic:cNvPr descr="/Applications/quarto/share/formats/docx/note.png" id="178" name="Picture"/>
+                          <pic:cNvPr descr="/Applications/quarto/share/formats/docx/note.png" id="184" name="Picture"/>
                           <pic:cNvPicPr>
                             <a:picLocks noChangeArrowheads="1" noChangeAspect="1"/>
                           </pic:cNvPicPr>
                         </pic:nvPicPr>
                         <pic:blipFill>
-                          <a:blip r:embed="rId94"/>
+                          <a:blip r:embed="rId100"/>
                           <a:stretch>
                             <a:fillRect/>
                           </a:stretch>
@@ -8326,8 +8495,8 @@
         </w:tc>
       </w:tr>
     </w:tbl>
-    <w:bookmarkEnd w:id="179"/>
-    <w:bookmarkStart w:id="182" w:name="tools-for-this-check"/>
+    <w:bookmarkEnd w:id="185"/>
+    <w:bookmarkStart w:id="190" w:name="tools-for-this-check"/>
     <w:p>
       <w:pPr>
         <w:pStyle w:val="Heading2"/>
@@ -8341,29 +8510,51 @@
         <w:pStyle w:val="Compact"/>
         <w:numPr>
           <w:ilvl w:val="0"/>
-          <w:numId w:val="1002"/>
+          <w:numId w:val="1003"/>
         </w:numPr>
       </w:pPr>
-      <w:hyperlink r:id="rId180">
+      <w:hyperlink r:id="rId186">
         <w:r>
           <w:rPr>
             <w:rStyle w:val="Hyperlink"/>
           </w:rPr>
-          <w:t xml:space="preserve">INSPECT-SR consistency checker for means and variances</w:t>
+          <w:t xml:space="preserve">INSPECT-SR granularity and bounds consistency checker for means and variances</w:t>
         </w:r>
       </w:hyperlink>
       <w:r>
         <w:t xml:space="preserve"> </w:t>
       </w:r>
       <w:r>
-        <w:t xml:space="preserve">— Lukas Jung and Ian Hussey’s web app for checking multiple values with GRIM and GRIMMER, with guidance on interpretation and the ability to download a copy of the results. Built on Lukas Jung’s</w:t>
-      </w:r>
-      <w:r>
-        <w:t xml:space="preserve"> </w:t>
-      </w:r>
-      <w:r>
-        <w:t xml:space="preserve">‘scrutiny’</w:t>
-      </w:r>
+        <w:t xml:space="preserve">— Lukas Jung and Ian Hussey’s web app for checking multiple values with GRIM and GRIMMER, with guidance on interpretation and the ability to download a copy of the results. Note that this web simultaneously applies INSPECT-SR check 4.10: bounds checks. Built on Lukas Jung’s</w:t>
+      </w:r>
+      <w:r>
+        <w:t xml:space="preserve"> </w:t>
+      </w:r>
+      <w:hyperlink r:id="rId187">
+        <w:r>
+          <w:rPr>
+            <w:rStyle w:val="Hyperlink"/>
+          </w:rPr>
+          <w:t xml:space="preserve">‘scrutiny’</w:t>
+        </w:r>
+      </w:hyperlink>
+      <w:r>
+        <w:t xml:space="preserve"> </w:t>
+      </w:r>
+      <w:r>
+        <w:t xml:space="preserve">R package and Ian Hussey’s</w:t>
+      </w:r>
+      <w:r>
+        <w:t xml:space="preserve"> </w:t>
+      </w:r>
+      <w:hyperlink r:id="rId188">
+        <w:r>
+          <w:rPr>
+            <w:rStyle w:val="Hyperlink"/>
+          </w:rPr>
+          <w:t xml:space="preserve">‘strait’</w:t>
+        </w:r>
+      </w:hyperlink>
       <w:r>
         <w:t xml:space="preserve"> </w:t>
       </w:r>
@@ -8376,10 +8567,10 @@
         <w:pStyle w:val="Compact"/>
         <w:numPr>
           <w:ilvl w:val="0"/>
-          <w:numId w:val="1002"/>
+          <w:numId w:val="1003"/>
         </w:numPr>
       </w:pPr>
-      <w:hyperlink r:id="rId181">
+      <w:hyperlink r:id="rId189">
         <w:r>
           <w:rPr>
             <w:rStyle w:val="Hyperlink"/>
@@ -8391,14 +8582,19 @@
         <w:t xml:space="preserve"> </w:t>
       </w:r>
       <w:r>
-        <w:t xml:space="preserve">— Lukas Jung’s more advanced web app for package for testing multiple values with GRIM and GRIMMER, plus diagnostics. Built on Lukas Jung’s</w:t>
-      </w:r>
-      <w:r>
-        <w:t xml:space="preserve"> </w:t>
-      </w:r>
-      <w:r>
-        <w:t xml:space="preserve">‘scrutiny’</w:t>
-      </w:r>
+        <w:t xml:space="preserve">— Lukas Jung’s more advanced web app for testing multiple values with GRIM and GRIMMER, plus diagnostics. Built on Lukas Jung’s</w:t>
+      </w:r>
+      <w:r>
+        <w:t xml:space="preserve"> </w:t>
+      </w:r>
+      <w:hyperlink r:id="rId187">
+        <w:r>
+          <w:rPr>
+            <w:rStyle w:val="Hyperlink"/>
+          </w:rPr>
+          <w:t xml:space="preserve">‘scrutiny’</w:t>
+        </w:r>
+      </w:hyperlink>
       <w:r>
         <w:t xml:space="preserve"> </w:t>
       </w:r>
@@ -8406,9 +8602,9 @@
         <w:t xml:space="preserve">R package.</w:t>
       </w:r>
     </w:p>
-    <w:bookmarkEnd w:id="182"/>
-    <w:bookmarkEnd w:id="183"/>
-    <w:bookmarkStart w:id="192" w:name="are-there-errors-in-statistical-results"/>
+    <w:bookmarkEnd w:id="190"/>
+    <w:bookmarkEnd w:id="191"/>
+    <w:bookmarkStart w:id="200" w:name="are-there-errors-in-statistical-results"/>
     <w:p>
       <w:pPr>
         <w:pStyle w:val="Heading1"/>
@@ -8616,7 +8812,7 @@
         <w:t xml:space="preserve">The answer to this check should contribute to a domain-level judgement.</w:t>
       </w:r>
     </w:p>
-    <w:bookmarkStart w:id="188" w:name="examples-6"/>
+    <w:bookmarkStart w:id="196" w:name="examples-6"/>
     <w:p>
       <w:pPr>
         <w:pStyle w:val="Heading2"/>
@@ -8666,18 +8862,18 @@
                 <wp:inline>
                   <wp:extent cx="152400" cy="152400"/>
                   <wp:effectExtent b="0" l="0" r="0" t="0"/>
-                  <wp:docPr descr="" title="" id="184" name="Picture"/>
+                  <wp:docPr descr="" title="" id="192" name="Picture"/>
                   <a:graphic>
                     <a:graphicData uri="http://schemas.openxmlformats.org/drawingml/2006/picture">
                       <pic:pic>
                         <pic:nvPicPr>
-                          <pic:cNvPr descr="/Applications/quarto/share/formats/docx/note.png" id="185" name="Picture"/>
+                          <pic:cNvPr descr="/Applications/quarto/share/formats/docx/note.png" id="193" name="Picture"/>
                           <pic:cNvPicPr>
                             <a:picLocks noChangeArrowheads="1" noChangeAspect="1"/>
                           </pic:cNvPicPr>
                         </pic:nvPicPr>
                         <pic:blipFill>
-                          <a:blip r:embed="rId94"/>
+                          <a:blip r:embed="rId100"/>
                           <a:stretch>
                             <a:fillRect/>
                           </a:stretch>
@@ -8802,18 +8998,18 @@
                 <wp:inline>
                   <wp:extent cx="152400" cy="152400"/>
                   <wp:effectExtent b="0" l="0" r="0" t="0"/>
-                  <wp:docPr descr="" title="" id="186" name="Picture"/>
+                  <wp:docPr descr="" title="" id="194" name="Picture"/>
                   <a:graphic>
                     <a:graphicData uri="http://schemas.openxmlformats.org/drawingml/2006/picture">
                       <pic:pic>
                         <pic:nvPicPr>
-                          <pic:cNvPr descr="/Applications/quarto/share/formats/docx/note.png" id="187" name="Picture"/>
+                          <pic:cNvPr descr="/Applications/quarto/share/formats/docx/note.png" id="195" name="Picture"/>
                           <pic:cNvPicPr>
                             <a:picLocks noChangeArrowheads="1" noChangeAspect="1"/>
                           </pic:cNvPicPr>
                         </pic:nvPicPr>
                         <pic:blipFill>
-                          <a:blip r:embed="rId94"/>
+                          <a:blip r:embed="rId100"/>
                           <a:stretch>
                             <a:fillRect/>
                           </a:stretch>
@@ -8901,8 +9097,8 @@
         </w:tc>
       </w:tr>
     </w:tbl>
-    <w:bookmarkEnd w:id="188"/>
-    <w:bookmarkStart w:id="191" w:name="tools-for-this-check-1"/>
+    <w:bookmarkEnd w:id="196"/>
+    <w:bookmarkStart w:id="199" w:name="tools-for-this-check-1"/>
     <w:p>
       <w:pPr>
         <w:pStyle w:val="Heading2"/>
@@ -8916,10 +9112,10 @@
         <w:pStyle w:val="Compact"/>
         <w:numPr>
           <w:ilvl w:val="0"/>
-          <w:numId w:val="1003"/>
+          <w:numId w:val="1004"/>
         </w:numPr>
       </w:pPr>
-      <w:hyperlink r:id="rId189">
+      <w:hyperlink r:id="rId197">
         <w:r>
           <w:rPr>
             <w:rStyle w:val="Hyperlink"/>
@@ -8939,10 +9135,10 @@
         <w:pStyle w:val="Compact"/>
         <w:numPr>
           <w:ilvl w:val="0"/>
-          <w:numId w:val="1003"/>
+          <w:numId w:val="1004"/>
         </w:numPr>
       </w:pPr>
-      <w:hyperlink r:id="rId190">
+      <w:hyperlink r:id="rId198">
         <w:r>
           <w:rPr>
             <w:rStyle w:val="Hyperlink"/>
@@ -8957,9 +9153,9 @@
         <w:t xml:space="preserve">— open source epidemiologic statistics</w:t>
       </w:r>
     </w:p>
-    <w:bookmarkEnd w:id="191"/>
-    <w:bookmarkEnd w:id="192"/>
-    <w:bookmarkStart w:id="196" w:name="Xf08106c8b1c1dfb3fce057a2ede192fa3c7f8cf"/>
+    <w:bookmarkEnd w:id="199"/>
+    <w:bookmarkEnd w:id="200"/>
+    <w:bookmarkStart w:id="211" w:name="Xf08106c8b1c1dfb3fce057a2ede192fa3c7f8cf"/>
     <w:p>
       <w:pPr>
         <w:pStyle w:val="Heading1"/>
@@ -8973,57 +9169,36 @@
         <w:pStyle w:val="FirstParagraph"/>
       </w:pPr>
       <w:r>
-        <w:t xml:space="preserve">There may be other instances of contradictory results that would not be detected using the other checks in this domain. Several examples have been identified, but appear to occur too infrequently to warrant routine checking. Should anomalies of this nature be observed, they may be recorded in response to this check. Specifically:</w:t>
-      </w:r>
-    </w:p>
-    <w:p>
-      <w:pPr>
-        <w:pStyle w:val="BodyText"/>
-      </w:pPr>
-      <w:r>
-        <w:t xml:space="preserve">Subgroup counts or means could conflict with results for the overall cohort.</w:t>
-      </w:r>
-    </w:p>
-    <w:p>
-      <w:pPr>
-        <w:pStyle w:val="BodyText"/>
-      </w:pPr>
-      <w:r>
-        <w:t xml:space="preserve">A mean value (for example) could fall outside of a reported range.</w:t>
-      </w:r>
-    </w:p>
-    <w:p>
-      <w:pPr>
-        <w:pStyle w:val="BodyText"/>
-      </w:pPr>
-      <w:r>
-        <w:t xml:space="preserve">Some combinations of outcome are not possible. For example, it is not possible to have more birth events (with one</w:t>
-      </w:r>
-      <w:r>
-        <w:t xml:space="preserve"> </w:t>
-      </w:r>
-      <w:r>
-        <w:t xml:space="preserve">“birth event”</w:t>
-      </w:r>
-      <w:r>
-        <w:t xml:space="preserve"> </w:t>
-      </w:r>
-      <w:r>
-        <w:t xml:space="preserve">defined as the birth of at least one child) than pregnancies.</w:t>
-      </w:r>
-    </w:p>
-    <w:p>
-      <w:pPr>
-        <w:pStyle w:val="BodyText"/>
-      </w:pPr>
-      <w:r>
-        <w:t xml:space="preserve">The answer to this check should contribute to a domain-level judgement.</w:t>
-      </w:r>
-    </w:p>
-    <w:bookmarkStart w:id="195" w:name="example-12"/>
+        <w:t xml:space="preserve">There may be other instances of contradictory results that would not be detected using the other checks in this domain. Several examples have been identified, but appear to occur too infrequently to warrant routine checking. Should anomalies of this nature be observed, they may be recorded in response to this check.</w:t>
+      </w:r>
+      <w:r>
+        <w:t xml:space="preserve"> </w:t>
+      </w:r>
+      <w:r>
+        <w:t xml:space="preserve">For example:</w:t>
+      </w:r>
+    </w:p>
+    <w:bookmarkStart w:id="207" w:name="X26101e7dfee21d5891c6897a9f8a7f15766261b"/>
     <w:p>
       <w:pPr>
         <w:pStyle w:val="Heading2"/>
+      </w:pPr>
+      <w:r>
+        <w:t xml:space="preserve">Overall cohort vs. subgroup descriptive statistics</w:t>
+      </w:r>
+    </w:p>
+    <w:p>
+      <w:pPr>
+        <w:pStyle w:val="FirstParagraph"/>
+      </w:pPr>
+      <w:r>
+        <w:t xml:space="preserve">Subgroup sample sizes, means, or Standard Deviations could conflict with results for the overall cohort.</w:t>
+      </w:r>
+    </w:p>
+    <w:bookmarkStart w:id="203" w:name="example-12"/>
+    <w:p>
+      <w:pPr>
+        <w:pStyle w:val="Heading3"/>
       </w:pPr>
       <w:r>
         <w:t xml:space="preserve">Example</w:t>
@@ -9070,18 +9245,18 @@
                 <wp:inline>
                   <wp:extent cx="152400" cy="152400"/>
                   <wp:effectExtent b="0" l="0" r="0" t="0"/>
-                  <wp:docPr descr="" title="" id="193" name="Picture"/>
+                  <wp:docPr descr="" title="" id="201" name="Picture"/>
                   <a:graphic>
                     <a:graphicData uri="http://schemas.openxmlformats.org/drawingml/2006/picture">
                       <pic:pic>
                         <pic:nvPicPr>
-                          <pic:cNvPr descr="/Applications/quarto/share/formats/docx/note.png" id="194" name="Picture"/>
+                          <pic:cNvPr descr="/Applications/quarto/share/formats/docx/note.png" id="202" name="Picture"/>
                           <pic:cNvPicPr>
                             <a:picLocks noChangeArrowheads="1" noChangeAspect="1"/>
                           </pic:cNvPicPr>
                         </pic:nvPicPr>
                         <pic:blipFill>
-                          <a:blip r:embed="rId94"/>
+                          <a:blip r:embed="rId100"/>
                           <a:stretch>
                             <a:fillRect/>
                           </a:stretch>
@@ -9157,9 +9332,191 @@
         </w:tc>
       </w:tr>
     </w:tbl>
-    <w:bookmarkEnd w:id="195"/>
-    <w:bookmarkEnd w:id="196"/>
-    <w:bookmarkStart w:id="200" w:name="X998e9ffda712adb8047b9e55733c83474380c7f"/>
+    <w:bookmarkEnd w:id="203"/>
+    <w:bookmarkStart w:id="206" w:name="tools-for-this-check-2"/>
+    <w:p>
+      <w:pPr>
+        <w:pStyle w:val="Heading3"/>
+      </w:pPr>
+      <w:r>
+        <w:t xml:space="preserve">Tools for this check</w:t>
+      </w:r>
+    </w:p>
+    <w:p>
+      <w:pPr>
+        <w:pStyle w:val="Compact"/>
+        <w:numPr>
+          <w:ilvl w:val="0"/>
+          <w:numId w:val="1005"/>
+        </w:numPr>
+      </w:pPr>
+      <w:hyperlink r:id="rId204">
+        <w:r>
+          <w:rPr>
+            <w:rStyle w:val="Hyperlink"/>
+          </w:rPr>
+          <w:t xml:space="preserve">INSPECT-SR consistency checker for overall cohort vs. subgroups</w:t>
+        </w:r>
+      </w:hyperlink>
+      <w:r>
+        <w:t xml:space="preserve"> </w:t>
+      </w:r>
+      <w:r>
+        <w:t xml:space="preserve">— Ian Hussey’s web app for checking multiple values, with guidance on interpretation and the ability to download a copy of the results. Built on Ian Hussey’s</w:t>
+      </w:r>
+      <w:r>
+        <w:t xml:space="preserve"> </w:t>
+      </w:r>
+      <w:hyperlink r:id="rId205">
+        <w:r>
+          <w:rPr>
+            <w:rStyle w:val="Hyperlink"/>
+          </w:rPr>
+          <w:t xml:space="preserve">‘recalc’</w:t>
+        </w:r>
+      </w:hyperlink>
+      <w:r>
+        <w:t xml:space="preserve"> </w:t>
+      </w:r>
+      <w:r>
+        <w:t xml:space="preserve">R package.</w:t>
+      </w:r>
+    </w:p>
+    <w:bookmarkEnd w:id="206"/>
+    <w:bookmarkEnd w:id="207"/>
+    <w:bookmarkStart w:id="209" w:name="bounds-checks"/>
+    <w:p>
+      <w:pPr>
+        <w:pStyle w:val="Heading2"/>
+      </w:pPr>
+      <w:r>
+        <w:t xml:space="preserve">Bounds checks</w:t>
+      </w:r>
+    </w:p>
+    <w:p>
+      <w:pPr>
+        <w:pStyle w:val="FirstParagraph"/>
+      </w:pPr>
+      <w:r>
+        <w:t xml:space="preserve">For example, a mean value could fall outside of a reported range: the mean of a 1-7 self-report Likert scale must be between 1 and 7. Equally, the reported Standard Deviations could fall outside the mathematical bounds set by the scale’s reported range.</w:t>
+      </w:r>
+    </w:p>
+    <w:p>
+      <w:pPr>
+        <w:pStyle w:val="BodyText"/>
+      </w:pPr>
+      <w:r>
+        <w:t xml:space="preserve">Consultation with a statistician may be useful to verify judgement.</w:t>
+      </w:r>
+    </w:p>
+    <w:bookmarkStart w:id="208" w:name="tools-for-this-check-3"/>
+    <w:p>
+      <w:pPr>
+        <w:pStyle w:val="Heading3"/>
+      </w:pPr>
+      <w:r>
+        <w:t xml:space="preserve">Tools for this check</w:t>
+      </w:r>
+    </w:p>
+    <w:p>
+      <w:pPr>
+        <w:pStyle w:val="Compact"/>
+        <w:numPr>
+          <w:ilvl w:val="0"/>
+          <w:numId w:val="1006"/>
+        </w:numPr>
+      </w:pPr>
+      <w:hyperlink r:id="rId186">
+        <w:r>
+          <w:rPr>
+            <w:rStyle w:val="Hyperlink"/>
+          </w:rPr>
+          <w:t xml:space="preserve">INSPECT-SR granularity and bounds consistency checker for means and variances</w:t>
+        </w:r>
+      </w:hyperlink>
+      <w:r>
+        <w:t xml:space="preserve"> </w:t>
+      </w:r>
+      <w:r>
+        <w:t xml:space="preserve">— Lukas Jung and Ian Hussey’s web app for checking multiple values with GRIM and GRIMMER, with guidance on interpretation and the ability to download a copy of the results. Built on Lukas Jung’s</w:t>
+      </w:r>
+      <w:r>
+        <w:t xml:space="preserve"> </w:t>
+      </w:r>
+      <w:hyperlink r:id="rId187">
+        <w:r>
+          <w:rPr>
+            <w:rStyle w:val="Hyperlink"/>
+          </w:rPr>
+          <w:t xml:space="preserve">‘scrutiny’</w:t>
+        </w:r>
+      </w:hyperlink>
+      <w:r>
+        <w:t xml:space="preserve"> </w:t>
+      </w:r>
+      <w:r>
+        <w:t xml:space="preserve">R package and Ian Hussey’s</w:t>
+      </w:r>
+      <w:r>
+        <w:t xml:space="preserve"> </w:t>
+      </w:r>
+      <w:hyperlink r:id="rId188">
+        <w:r>
+          <w:rPr>
+            <w:rStyle w:val="Hyperlink"/>
+          </w:rPr>
+          <w:t xml:space="preserve">‘strait’</w:t>
+        </w:r>
+      </w:hyperlink>
+      <w:r>
+        <w:t xml:space="preserve"> </w:t>
+      </w:r>
+      <w:r>
+        <w:t xml:space="preserve">R package.</w:t>
+      </w:r>
+    </w:p>
+    <w:bookmarkEnd w:id="208"/>
+    <w:bookmarkEnd w:id="209"/>
+    <w:bookmarkStart w:id="210" w:name="X39577653f0aa7b4eb84ab3d32eb92cf37c69b0f"/>
+    <w:p>
+      <w:pPr>
+        <w:pStyle w:val="Heading2"/>
+      </w:pPr>
+      <w:r>
+        <w:t xml:space="preserve">Some combinations of outcome are not possible</w:t>
+      </w:r>
+    </w:p>
+    <w:p>
+      <w:pPr>
+        <w:pStyle w:val="FirstParagraph"/>
+      </w:pPr>
+      <w:r>
+        <w:t xml:space="preserve">For example, it is not possible to have more birth events (with one</w:t>
+      </w:r>
+      <w:r>
+        <w:t xml:space="preserve"> </w:t>
+      </w:r>
+      <w:r>
+        <w:t xml:space="preserve">“birth event”</w:t>
+      </w:r>
+      <w:r>
+        <w:t xml:space="preserve"> </w:t>
+      </w:r>
+      <w:r>
+        <w:t xml:space="preserve">defined as the birth of at least one child) than pregnancies.</w:t>
+      </w:r>
+    </w:p>
+    <w:p>
+      <w:pPr>
+        <w:pStyle w:val="BodyText"/>
+      </w:pPr>
+      <w:r>
+        <w:t xml:space="preserve">The answer to this check should contribute to a domain-level judgement.</w:t>
+      </w:r>
+    </w:p>
+    <w:bookmarkEnd w:id="210"/>
+    <w:bookmarkEnd w:id="211"/>
+    <w:bookmarkStart w:id="215" w:name="X998e9ffda712adb8047b9e55733c83474380c7f"/>
     <w:p>
       <w:pPr>
         <w:pStyle w:val="Heading1"/>
@@ -9192,7 +9549,7 @@
         <w:t xml:space="preserve">The answer to this check should contribute to a domain-level judgement.</w:t>
       </w:r>
     </w:p>
-    <w:bookmarkStart w:id="199" w:name="example-13"/>
+    <w:bookmarkStart w:id="214" w:name="example-13"/>
     <w:p>
       <w:pPr>
         <w:pStyle w:val="Heading2"/>
@@ -9242,18 +9599,18 @@
                 <wp:inline>
                   <wp:extent cx="152400" cy="152400"/>
                   <wp:effectExtent b="0" l="0" r="0" t="0"/>
-                  <wp:docPr descr="" title="" id="197" name="Picture"/>
+                  <wp:docPr descr="" title="" id="212" name="Picture"/>
                   <a:graphic>
                     <a:graphicData uri="http://schemas.openxmlformats.org/drawingml/2006/picture">
                       <pic:pic>
                         <pic:nvPicPr>
-                          <pic:cNvPr descr="/Applications/quarto/share/formats/docx/note.png" id="198" name="Picture"/>
+                          <pic:cNvPr descr="/Applications/quarto/share/formats/docx/note.png" id="213" name="Picture"/>
                           <pic:cNvPicPr>
                             <a:picLocks noChangeArrowheads="1" noChangeAspect="1"/>
                           </pic:cNvPicPr>
                         </pic:nvPicPr>
                         <pic:blipFill>
-                          <a:blip r:embed="rId94"/>
+                          <a:blip r:embed="rId100"/>
                           <a:stretch>
                             <a:fillRect/>
                           </a:stretch>
@@ -9329,9 +9686,9 @@
         </w:tc>
       </w:tr>
     </w:tbl>
-    <w:bookmarkEnd w:id="199"/>
-    <w:bookmarkEnd w:id="200"/>
-    <w:bookmarkStart w:id="204" w:name="changelog"/>
+    <w:bookmarkEnd w:id="214"/>
+    <w:bookmarkEnd w:id="215"/>
+    <w:bookmarkStart w:id="219" w:name="changelog"/>
     <w:p>
       <w:pPr>
         <w:pStyle w:val="Heading1"/>
@@ -9348,7 +9705,7 @@
         <w:t xml:space="preserve">Changes from previous version.</w:t>
       </w:r>
     </w:p>
-    <w:bookmarkStart w:id="201" w:name="v1.1.2"/>
+    <w:bookmarkStart w:id="216" w:name="v1.1.2"/>
     <w:p>
       <w:pPr>
         <w:pStyle w:val="Heading2"/>
@@ -9362,15 +9719,15 @@
         <w:pStyle w:val="Compact"/>
         <w:numPr>
           <w:ilvl w:val="0"/>
-          <w:numId w:val="1004"/>
+          <w:numId w:val="1007"/>
         </w:numPr>
       </w:pPr>
       <w:r>
         <w:t xml:space="preserve">Edits to guidance for checks 4.8 and 4.9 to improve clarity in response to feedback.</w:t>
       </w:r>
     </w:p>
-    <w:bookmarkEnd w:id="201"/>
-    <w:bookmarkStart w:id="202" w:name="v1.1.1"/>
+    <w:bookmarkEnd w:id="216"/>
+    <w:bookmarkStart w:id="217" w:name="v1.1.1"/>
     <w:p>
       <w:pPr>
         <w:pStyle w:val="Heading2"/>
@@ -9384,7 +9741,7 @@
         <w:pStyle w:val="Compact"/>
         <w:numPr>
           <w:ilvl w:val="0"/>
-          <w:numId w:val="1005"/>
+          <w:numId w:val="1008"/>
         </w:numPr>
       </w:pPr>
       <w:r>
@@ -9393,7 +9750,7 @@
       <w:r>
         <w:t xml:space="preserve"> </w:t>
       </w:r>
-      <w:hyperlink r:id="rId180">
+      <w:hyperlink r:id="rId186">
         <w:r>
           <w:rPr>
             <w:rStyle w:val="Hyperlink"/>
@@ -9408,8 +9765,8 @@
         <w:t xml:space="preserve">and remove the no longer working prepubmed GRIMMER checker.</w:t>
       </w:r>
     </w:p>
-    <w:bookmarkEnd w:id="202"/>
-    <w:bookmarkStart w:id="203" w:name="v1.1"/>
+    <w:bookmarkEnd w:id="217"/>
+    <w:bookmarkStart w:id="218" w:name="v1.1"/>
     <w:p>
       <w:pPr>
         <w:pStyle w:val="Heading2"/>
@@ -9423,7 +9780,7 @@
         <w:pStyle w:val="Compact"/>
         <w:numPr>
           <w:ilvl w:val="0"/>
-          <w:numId w:val="1006"/>
+          <w:numId w:val="1009"/>
         </w:numPr>
       </w:pPr>
       <w:r>
@@ -9435,7 +9792,7 @@
         <w:pStyle w:val="Compact"/>
         <w:numPr>
           <w:ilvl w:val="0"/>
-          <w:numId w:val="1006"/>
+          <w:numId w:val="1009"/>
         </w:numPr>
       </w:pPr>
       <w:r>
@@ -9447,7 +9804,7 @@
         <w:pStyle w:val="Compact"/>
         <w:numPr>
           <w:ilvl w:val="0"/>
-          <w:numId w:val="1006"/>
+          <w:numId w:val="1009"/>
         </w:numPr>
       </w:pPr>
       <w:r>
@@ -9459,7 +9816,7 @@
         <w:pStyle w:val="Compact"/>
         <w:numPr>
           <w:ilvl w:val="0"/>
-          <w:numId w:val="1006"/>
+          <w:numId w:val="1009"/>
         </w:numPr>
       </w:pPr>
       <w:r>
@@ -9507,7 +9864,7 @@
         <w:pStyle w:val="Compact"/>
         <w:numPr>
           <w:ilvl w:val="0"/>
-          <w:numId w:val="1006"/>
+          <w:numId w:val="1009"/>
         </w:numPr>
       </w:pPr>
       <w:r>
@@ -9531,16 +9888,16 @@
         <w:pStyle w:val="Compact"/>
         <w:numPr>
           <w:ilvl w:val="0"/>
-          <w:numId w:val="1006"/>
+          <w:numId w:val="1009"/>
         </w:numPr>
       </w:pPr>
       <w:r>
         <w:t xml:space="preserve">Text added to check 2.2. to make it clear that lack of registration for older studies may still impact trustworthiness.</w:t>
       </w:r>
     </w:p>
-    <w:bookmarkEnd w:id="203"/>
-    <w:bookmarkEnd w:id="204"/>
-    <w:bookmarkStart w:id="206" w:name="editable-template"/>
+    <w:bookmarkEnd w:id="218"/>
+    <w:bookmarkEnd w:id="219"/>
+    <w:bookmarkStart w:id="220" w:name="editable-template"/>
     <w:p>
       <w:pPr>
         <w:pStyle w:val="Heading1"/>
@@ -9561,7 +9918,7 @@
       <w:pPr>
         <w:pStyle w:val="BodyText"/>
       </w:pPr>
-      <w:hyperlink r:id="rId205">
+      <w:hyperlink r:id="rId76">
         <w:r>
           <w:rPr>
             <w:rStyle w:val="Hyperlink"/>
@@ -9570,80 +9927,7 @@
         </w:r>
       </w:hyperlink>
     </w:p>
-    <w:bookmarkEnd w:id="206"/>
-    <w:bookmarkStart w:id="209" w:name="license"/>
-    <w:p>
-      <w:pPr>
-        <w:pStyle w:val="Heading1"/>
-      </w:pPr>
-      <w:r>
-        <w:t xml:space="preserve">License</w:t>
-      </w:r>
-    </w:p>
-    <w:p>
-      <w:pPr>
-        <w:pStyle w:val="FirstParagraph"/>
-      </w:pPr>
-      <w:r>
-        <w:t xml:space="preserve">© Jack Wilkinson (2026)</w:t>
-      </w:r>
-    </w:p>
-    <w:p>
-      <w:pPr>
-        <w:pStyle w:val="BodyText"/>
-      </w:pPr>
-      <w:r>
-        <w:t xml:space="preserve">Text and figures are licensed under a</w:t>
-      </w:r>
-      <w:r>
-        <w:t xml:space="preserve"> </w:t>
-      </w:r>
-      <w:hyperlink r:id="rId207">
-        <w:r>
-          <w:rPr>
-            <w:rStyle w:val="Hyperlink"/>
-          </w:rPr>
-          <w:t xml:space="preserve">Creative Commons Attribution 4.0 (CC BY 4.0)</w:t>
-        </w:r>
-      </w:hyperlink>
-      <w:r>
-        <w:t xml:space="preserve"> </w:t>
-      </w:r>
-      <w:r>
-        <w:t xml:space="preserve">license.</w:t>
-      </w:r>
-    </w:p>
-    <w:p>
-      <w:pPr>
-        <w:pStyle w:val="BodyText"/>
-      </w:pPr>
-      <w:r>
-        <w:t xml:space="preserve">Code is licensed under the</w:t>
-      </w:r>
-      <w:r>
-        <w:t xml:space="preserve"> </w:t>
-      </w:r>
-      <w:hyperlink r:id="rId208">
-        <w:r>
-          <w:rPr>
-            <w:rStyle w:val="Hyperlink"/>
-          </w:rPr>
-          <w:t xml:space="preserve">MIT License</w:t>
-        </w:r>
-      </w:hyperlink>
-      <w:r>
-        <w:t xml:space="preserve">.</w:t>
-      </w:r>
-    </w:p>
-    <w:p>
-      <w:pPr>
-        <w:pStyle w:val="BodyText"/>
-      </w:pPr>
-      <w:r>
-        <w:t xml:space="preserve">You are free to copy, share, adapt, and reuse the contents of this book — text, figures, and code — for any purpose, including commercial use, provided you cite it.</w:t>
-      </w:r>
-    </w:p>
-    <w:bookmarkEnd w:id="209"/>
+    <w:bookmarkEnd w:id="220"/>
     <w:sectPr>
       <w:headerReference r:id="rId9" w:type="even"/>
       <w:headerReference r:id="rId11" w:type="default"/>
@@ -10153,6 +10437,15 @@
     <w:abstractNumId w:val="991"/>
   </w:num>
   <w:num w:numId="1006">
+    <w:abstractNumId w:val="991"/>
+  </w:num>
+  <w:num w:numId="1007">
+    <w:abstractNumId w:val="991"/>
+  </w:num>
+  <w:num w:numId="1008">
+    <w:abstractNumId w:val="991"/>
+  </w:num>
+  <w:num w:numId="1009">
     <w:abstractNumId w:val="991"/>
   </w:num>
 </w:numbering>

</xml_diff>